<commit_message>
Reestrutura a prática do roteiro em dois cenários (sem Andon e com Andon)
Co-Authored-By: Claude Sonnet 5.5 <noreply@anthropic.com>
Claude-Session: https://claude.ai/code/session_01E4wB5DMDRLvxuMcN1wRscX
</commit_message>
<xml_diff>
--- a/roteiro-geral-integrante-4.docx
+++ b/roteiro-geral-integrante-4.docx
@@ -2,7 +2,7 @@
 <file path=word/document.xml><?xml version="1.0" encoding="utf-8"?>
 <w:document xmlns:w="http://schemas.openxmlformats.org/wordprocessingml/2006/main" xmlns:m="http://schemas.openxmlformats.org/officeDocument/2006/math" xmlns:r="http://schemas.openxmlformats.org/officeDocument/2006/relationships" xmlns:o="urn:schemas-microsoft-com:office:office" xmlns:v="urn:schemas-microsoft-com:vml" xmlns:w10="urn:schemas-microsoft-com:office:word" xmlns:a="http://schemas.openxmlformats.org/drawingml/2006/main" xmlns:pic="http://schemas.openxmlformats.org/drawingml/2006/picture" xmlns:wp="http://schemas.openxmlformats.org/drawingml/2006/wordprocessingDrawing">
   <w:body>
-    <w:bookmarkStart w:id="29" w:name="Xd0bf2c09c49581cb21e44bd2144b58dccda3b1e"/>
+    <w:bookmarkStart w:id="30" w:name="Xd0bf2c09c49581cb21e44bd2144b58dccda3b1e"/>
     <w:p>
       <w:pPr>
         <w:pStyle w:val="Heading1"/>
@@ -83,6 +83,83 @@
           <w:rFonts w:ascii="Arial" w:hAnsi="Arial"/>
         </w:rPr>
         <w:t xml:space="preserve">Visão rápida</w:t>
+      </w:r>
+    </w:p>
+    <w:p>
+      <w:pPr>
+        <w:pStyle w:val="FirstParagraph"/>
+      </w:pPr>
+      <w:r>
+        <w:rPr>
+          <w:rFonts w:ascii="Arial" w:hAnsi="Arial"/>
+        </w:rPr>
+        <w:t xml:space="preserve">A prática agora tem</w:t>
+      </w:r>
+      <w:r>
+        <w:rPr>
+          <w:rFonts w:ascii="Arial" w:hAnsi="Arial"/>
+        </w:rPr>
+        <w:t xml:space="preserve"> </w:t>
+      </w:r>
+      <w:r>
+        <w:rPr>
+          <w:bCs/>
+          <w:rFonts w:ascii="Arial" w:hAnsi="Arial"/>
+          <w:b/>
+        </w:rPr>
+        <w:t xml:space="preserve">dois cenários</w:t>
+      </w:r>
+      <w:r>
+        <w:rPr>
+          <w:rFonts w:ascii="Arial" w:hAnsi="Arial"/>
+        </w:rPr>
+        <w:t xml:space="preserve"> </w:t>
+      </w:r>
+      <w:r>
+        <w:rPr>
+          <w:rFonts w:ascii="Arial" w:hAnsi="Arial"/>
+        </w:rPr>
+        <w:t xml:space="preserve">com a mesma situação (as folhas acabam): primeiro</w:t>
+      </w:r>
+      <w:r>
+        <w:rPr>
+          <w:rFonts w:ascii="Arial" w:hAnsi="Arial"/>
+        </w:rPr>
+        <w:t xml:space="preserve"> </w:t>
+      </w:r>
+      <w:r>
+        <w:rPr>
+          <w:bCs/>
+          <w:rFonts w:ascii="Arial" w:hAnsi="Arial"/>
+          <w:b/>
+        </w:rPr>
+        <w:t xml:space="preserve">sem Andon</w:t>
+      </w:r>
+      <w:r>
+        <w:rPr>
+          <w:rFonts w:ascii="Arial" w:hAnsi="Arial"/>
+        </w:rPr>
+        <w:t xml:space="preserve">, depois</w:t>
+      </w:r>
+      <w:r>
+        <w:rPr>
+          <w:rFonts w:ascii="Arial" w:hAnsi="Arial"/>
+        </w:rPr>
+        <w:t xml:space="preserve"> </w:t>
+      </w:r>
+      <w:r>
+        <w:rPr>
+          <w:bCs/>
+          <w:rFonts w:ascii="Arial" w:hAnsi="Arial"/>
+          <w:b/>
+        </w:rPr>
+        <w:t xml:space="preserve">com Andon</w:t>
+      </w:r>
+      <w:r>
+        <w:rPr>
+          <w:rFonts w:ascii="Arial" w:hAnsi="Arial"/>
+        </w:rPr>
+        <w:t xml:space="preserve">. Cada cenário usa 5 folhas. As folhas representam a matéria-prima: não importa quantas sejam, uma hora elas acabam.</w:t>
       </w:r>
     </w:p>
     <w:tbl>
@@ -102,10 +179,10 @@
         <w:tblLayout w:type="fixed"/>
       </w:tblPr>
       <w:tblGrid>
-        <w:gridCol w:w="2666"/>
-        <w:gridCol w:w="1664"/>
-        <w:gridCol w:w="1390"/>
-        <w:gridCol w:w="3916"/>
+        <w:gridCol w:w="2519"/>
+        <w:gridCol w:w="1715"/>
+        <w:gridCol w:w="1443"/>
+        <w:gridCol w:w="3959"/>
       </w:tblGrid>
       <w:tr>
         <w:trPr>
@@ -113,7 +190,7 @@
         </w:trPr>
         <w:tc>
           <w:tcPr>
-            <w:tcW w:type="dxa" w:w="2667"/>
+            <w:tcW w:type="dxa" w:w="2519"/>
             <w:shd w:val="clear" w:fill="1F3864"/>
           </w:tcPr>
           <w:p>
@@ -134,7 +211,7 @@
         </w:tc>
         <w:tc>
           <w:tcPr>
-            <w:tcW w:type="dxa" w:w="1664"/>
+            <w:tcW w:type="dxa" w:w="1716"/>
             <w:shd w:val="clear" w:fill="1F3864"/>
           </w:tcPr>
           <w:p>
@@ -155,7 +232,7 @@
         </w:tc>
         <w:tc>
           <w:tcPr>
-            <w:tcW w:type="dxa" w:w="1391"/>
+            <w:tcW w:type="dxa" w:w="1443"/>
             <w:shd w:val="clear" w:fill="1F3864"/>
           </w:tcPr>
           <w:p>
@@ -176,7 +253,7 @@
         </w:tc>
         <w:tc>
           <w:tcPr>
-            <w:tcW w:type="dxa" w:w="3916"/>
+            <w:tcW w:type="dxa" w:w="3960"/>
             <w:shd w:val="clear" w:fill="1F3864"/>
           </w:tcPr>
           <w:p>
@@ -199,7 +276,7 @@
       <w:tr>
         <w:tc>
           <w:tcPr>
-            <w:tcW w:type="dxa" w:w="2667"/>
+            <w:tcW w:type="dxa" w:w="2519"/>
           </w:tcPr>
           <w:p>
             <w:pPr>
@@ -217,7 +294,7 @@
         </w:tc>
         <w:tc>
           <w:tcPr>
-            <w:tcW w:type="dxa" w:w="1664"/>
+            <w:tcW w:type="dxa" w:w="1716"/>
           </w:tcPr>
           <w:p>
             <w:pPr>
@@ -235,7 +312,7 @@
         </w:tc>
         <w:tc>
           <w:tcPr>
-            <w:tcW w:type="dxa" w:w="1391"/>
+            <w:tcW w:type="dxa" w:w="1443"/>
           </w:tcPr>
           <w:p>
             <w:pPr>
@@ -253,7 +330,7 @@
         </w:tc>
         <w:tc>
           <w:tcPr>
-            <w:tcW w:type="dxa" w:w="3916"/>
+            <w:tcW w:type="dxa" w:w="3960"/>
           </w:tcPr>
           <w:p>
             <w:pPr>
@@ -273,7 +350,7 @@
       <w:tr>
         <w:tc>
           <w:tcPr>
-            <w:tcW w:type="dxa" w:w="2667"/>
+            <w:tcW w:type="dxa" w:w="2519"/>
           </w:tcPr>
           <w:p>
             <w:pPr>
@@ -291,7 +368,7 @@
         </w:tc>
         <w:tc>
           <w:tcPr>
-            <w:tcW w:type="dxa" w:w="1664"/>
+            <w:tcW w:type="dxa" w:w="1716"/>
           </w:tcPr>
           <w:p>
             <w:pPr>
@@ -309,37 +386,37 @@
         </w:tc>
         <w:tc>
           <w:tcPr>
-            <w:tcW w:type="dxa" w:w="1391"/>
-          </w:tcPr>
-          <w:p>
-            <w:pPr>
-              <w:pStyle w:val="Compact"/>
-              <w:spacing w:after="40"/>
-              <w:jc w:val="left"/>
-            </w:pPr>
-            <w:r>
-              <w:rPr>
-                <w:sz w:val="20"/>
-              </w:rPr>
-              <w:t xml:space="preserve">40 s</w:t>
-            </w:r>
-          </w:p>
-        </w:tc>
-        <w:tc>
-          <w:tcPr>
-            <w:tcW w:type="dxa" w:w="3916"/>
-          </w:tcPr>
-          <w:p>
-            <w:pPr>
-              <w:pStyle w:val="Compact"/>
-              <w:spacing w:after="40"/>
-              <w:jc w:val="left"/>
-            </w:pPr>
-            <w:r>
-              <w:rPr>
-                <w:sz w:val="20"/>
-              </w:rPr>
-              <w:t xml:space="preserve">Apresento papéis e o simulador (HTML, CSS, JS)</w:t>
+            <w:tcW w:type="dxa" w:w="1443"/>
+          </w:tcPr>
+          <w:p>
+            <w:pPr>
+              <w:pStyle w:val="Compact"/>
+              <w:spacing w:after="40"/>
+              <w:jc w:val="left"/>
+            </w:pPr>
+            <w:r>
+              <w:rPr>
+                <w:sz w:val="20"/>
+              </w:rPr>
+              <w:t xml:space="preserve">1 min</w:t>
+            </w:r>
+          </w:p>
+        </w:tc>
+        <w:tc>
+          <w:tcPr>
+            <w:tcW w:type="dxa" w:w="3960"/>
+          </w:tcPr>
+          <w:p>
+            <w:pPr>
+              <w:pStyle w:val="Compact"/>
+              <w:spacing w:after="40"/>
+              <w:jc w:val="left"/>
+            </w:pPr>
+            <w:r>
+              <w:rPr>
+                <w:sz w:val="20"/>
+              </w:rPr>
+              <w:t xml:space="preserve">Explico a ideia dos dois cenários, os papéis e o simulador</w:t>
             </w:r>
           </w:p>
         </w:tc>
@@ -347,73 +424,73 @@
       <w:tr>
         <w:tc>
           <w:tcPr>
-            <w:tcW w:type="dxa" w:w="2667"/>
-          </w:tcPr>
-          <w:p>
-            <w:pPr>
-              <w:pStyle w:val="Compact"/>
-              <w:spacing w:after="40"/>
-              <w:jc w:val="left"/>
-            </w:pPr>
-            <w:r>
-              <w:rPr>
-                <w:sz w:val="20"/>
-              </w:rPr>
-              <w:t xml:space="preserve">Dinâmica, etapas 1 a 5</w:t>
-            </w:r>
-          </w:p>
-        </w:tc>
-        <w:tc>
-          <w:tcPr>
-            <w:tcW w:type="dxa" w:w="1664"/>
-          </w:tcPr>
-          <w:p>
-            <w:pPr>
-              <w:pStyle w:val="Compact"/>
-              <w:spacing w:after="40"/>
-              <w:jc w:val="left"/>
-            </w:pPr>
-            <w:r>
-              <w:rPr>
-                <w:sz w:val="20"/>
-              </w:rPr>
-              <w:t xml:space="preserve">11 + simulador</w:t>
-            </w:r>
-          </w:p>
-        </w:tc>
-        <w:tc>
-          <w:tcPr>
-            <w:tcW w:type="dxa" w:w="1391"/>
-          </w:tcPr>
-          <w:p>
-            <w:pPr>
-              <w:pStyle w:val="Compact"/>
-              <w:spacing w:after="40"/>
-              <w:jc w:val="left"/>
-            </w:pPr>
-            <w:r>
-              <w:rPr>
-                <w:sz w:val="20"/>
-              </w:rPr>
-              <w:t xml:space="preserve">5 a 6 min</w:t>
-            </w:r>
-          </w:p>
-        </w:tc>
-        <w:tc>
-          <w:tcPr>
-            <w:tcW w:type="dxa" w:w="3916"/>
-          </w:tcPr>
-          <w:p>
-            <w:pPr>
-              <w:pStyle w:val="Compact"/>
-              <w:spacing w:after="40"/>
-              <w:jc w:val="left"/>
-            </w:pPr>
-            <w:r>
-              <w:rPr>
-                <w:sz w:val="20"/>
-              </w:rPr>
-              <w:t xml:space="preserve">Narro cada etapa e clico em "Enviar chamado"</w:t>
+            <w:tcW w:type="dxa" w:w="2519"/>
+          </w:tcPr>
+          <w:p>
+            <w:pPr>
+              <w:pStyle w:val="Compact"/>
+              <w:spacing w:after="40"/>
+              <w:jc w:val="left"/>
+            </w:pPr>
+            <w:r>
+              <w:rPr>
+                <w:sz w:val="20"/>
+              </w:rPr>
+              <w:t xml:space="preserve">Cenário 1: sem Andon</w:t>
+            </w:r>
+          </w:p>
+        </w:tc>
+        <w:tc>
+          <w:tcPr>
+            <w:tcW w:type="dxa" w:w="1716"/>
+          </w:tcPr>
+          <w:p>
+            <w:pPr>
+              <w:pStyle w:val="Compact"/>
+              <w:spacing w:after="40"/>
+              <w:jc w:val="left"/>
+            </w:pPr>
+            <w:r>
+              <w:rPr>
+                <w:sz w:val="20"/>
+              </w:rPr>
+              <w:t xml:space="preserve">10 (sem clicar)</w:t>
+            </w:r>
+          </w:p>
+        </w:tc>
+        <w:tc>
+          <w:tcPr>
+            <w:tcW w:type="dxa" w:w="1443"/>
+          </w:tcPr>
+          <w:p>
+            <w:pPr>
+              <w:pStyle w:val="Compact"/>
+              <w:spacing w:after="40"/>
+              <w:jc w:val="left"/>
+            </w:pPr>
+            <w:r>
+              <w:rPr>
+                <w:sz w:val="20"/>
+              </w:rPr>
+              <w:t xml:space="preserve">1 min 30 s</w:t>
+            </w:r>
+          </w:p>
+        </w:tc>
+        <w:tc>
+          <w:tcPr>
+            <w:tcW w:type="dxa" w:w="3960"/>
+          </w:tcPr>
+          <w:p>
+            <w:pPr>
+              <w:pStyle w:val="Compact"/>
+              <w:spacing w:after="40"/>
+              <w:jc w:val="left"/>
+            </w:pPr>
+            <w:r>
+              <w:rPr>
+                <w:sz w:val="20"/>
+              </w:rPr>
+              <w:t xml:space="preserve">Cronometro a parada e mostro o simulador zerado</w:t>
             </w:r>
           </w:p>
         </w:tc>
@@ -421,73 +498,73 @@
       <w:tr>
         <w:tc>
           <w:tcPr>
-            <w:tcW w:type="dxa" w:w="2667"/>
-          </w:tcPr>
-          <w:p>
-            <w:pPr>
-              <w:pStyle w:val="Compact"/>
-              <w:spacing w:after="40"/>
-              <w:jc w:val="left"/>
-            </w:pPr>
-            <w:r>
-              <w:rPr>
-                <w:sz w:val="20"/>
-              </w:rPr>
-              <w:t xml:space="preserve">Pergunta para a turma</w:t>
-            </w:r>
-          </w:p>
-        </w:tc>
-        <w:tc>
-          <w:tcPr>
-            <w:tcW w:type="dxa" w:w="1664"/>
-          </w:tcPr>
-          <w:p>
-            <w:pPr>
-              <w:pStyle w:val="Compact"/>
-              <w:spacing w:after="40"/>
-              <w:jc w:val="left"/>
-            </w:pPr>
-            <w:r>
-              <w:rPr>
-                <w:sz w:val="20"/>
-              </w:rPr>
-              <w:t xml:space="preserve">12</w:t>
-            </w:r>
-          </w:p>
-        </w:tc>
-        <w:tc>
-          <w:tcPr>
-            <w:tcW w:type="dxa" w:w="1391"/>
-          </w:tcPr>
-          <w:p>
-            <w:pPr>
-              <w:pStyle w:val="Compact"/>
-              <w:spacing w:after="40"/>
-              <w:jc w:val="left"/>
-            </w:pPr>
-            <w:r>
-              <w:rPr>
-                <w:sz w:val="20"/>
-              </w:rPr>
-              <w:t xml:space="preserve">1 min</w:t>
-            </w:r>
-          </w:p>
-        </w:tc>
-        <w:tc>
-          <w:tcPr>
-            <w:tcW w:type="dxa" w:w="3916"/>
-          </w:tcPr>
-          <w:p>
-            <w:pPr>
-              <w:pStyle w:val="Compact"/>
-              <w:spacing w:after="40"/>
-              <w:jc w:val="left"/>
-            </w:pPr>
-            <w:r>
-              <w:rPr>
-                <w:sz w:val="20"/>
-              </w:rPr>
-              <w:t xml:space="preserve">Pergunto, espero, complemento</w:t>
+            <w:tcW w:type="dxa" w:w="2519"/>
+          </w:tcPr>
+          <w:p>
+            <w:pPr>
+              <w:pStyle w:val="Compact"/>
+              <w:spacing w:after="40"/>
+              <w:jc w:val="left"/>
+            </w:pPr>
+            <w:r>
+              <w:rPr>
+                <w:sz w:val="20"/>
+              </w:rPr>
+              <w:t xml:space="preserve">Cenário 2: com Andon</w:t>
+            </w:r>
+          </w:p>
+        </w:tc>
+        <w:tc>
+          <w:tcPr>
+            <w:tcW w:type="dxa" w:w="1716"/>
+          </w:tcPr>
+          <w:p>
+            <w:pPr>
+              <w:pStyle w:val="Compact"/>
+              <w:spacing w:after="40"/>
+              <w:jc w:val="left"/>
+            </w:pPr>
+            <w:r>
+              <w:rPr>
+                <w:sz w:val="20"/>
+              </w:rPr>
+              <w:t xml:space="preserve">11 + simulador</w:t>
+            </w:r>
+          </w:p>
+        </w:tc>
+        <w:tc>
+          <w:tcPr>
+            <w:tcW w:type="dxa" w:w="1443"/>
+          </w:tcPr>
+          <w:p>
+            <w:pPr>
+              <w:pStyle w:val="Compact"/>
+              <w:spacing w:after="40"/>
+              <w:jc w:val="left"/>
+            </w:pPr>
+            <w:r>
+              <w:rPr>
+                <w:sz w:val="20"/>
+              </w:rPr>
+              <w:t xml:space="preserve">2 min 30 s</w:t>
+            </w:r>
+          </w:p>
+        </w:tc>
+        <w:tc>
+          <w:tcPr>
+            <w:tcW w:type="dxa" w:w="3960"/>
+          </w:tcPr>
+          <w:p>
+            <w:pPr>
+              <w:pStyle w:val="Compact"/>
+              <w:spacing w:after="40"/>
+              <w:jc w:val="left"/>
+            </w:pPr>
+            <w:r>
+              <w:rPr>
+                <w:sz w:val="20"/>
+              </w:rPr>
+              <w:t xml:space="preserve">Narro as etapas e clico em "Enviar chamado"</w:t>
             </w:r>
           </w:p>
         </w:tc>
@@ -495,73 +572,73 @@
       <w:tr>
         <w:tc>
           <w:tcPr>
-            <w:tcW w:type="dxa" w:w="2667"/>
-          </w:tcPr>
-          <w:p>
-            <w:pPr>
-              <w:pStyle w:val="Compact"/>
-              <w:spacing w:after="40"/>
-              <w:jc w:val="left"/>
-            </w:pPr>
-            <w:r>
-              <w:rPr>
-                <w:sz w:val="20"/>
-              </w:rPr>
-              <w:t xml:space="preserve">Fechamento</w:t>
-            </w:r>
-          </w:p>
-        </w:tc>
-        <w:tc>
-          <w:tcPr>
-            <w:tcW w:type="dxa" w:w="1664"/>
-          </w:tcPr>
-          <w:p>
-            <w:pPr>
-              <w:pStyle w:val="Compact"/>
-              <w:spacing w:after="40"/>
-              <w:jc w:val="left"/>
-            </w:pPr>
-            <w:r>
-              <w:rPr>
-                <w:sz w:val="20"/>
-              </w:rPr>
-              <w:t xml:space="preserve">13</w:t>
-            </w:r>
-          </w:p>
-        </w:tc>
-        <w:tc>
-          <w:tcPr>
-            <w:tcW w:type="dxa" w:w="1391"/>
-          </w:tcPr>
-          <w:p>
-            <w:pPr>
-              <w:pStyle w:val="Compact"/>
-              <w:spacing w:after="40"/>
-              <w:jc w:val="left"/>
-            </w:pPr>
-            <w:r>
-              <w:rPr>
-                <w:sz w:val="20"/>
-              </w:rPr>
-              <w:t xml:space="preserve">30 s</w:t>
-            </w:r>
-          </w:p>
-        </w:tc>
-        <w:tc>
-          <w:tcPr>
-            <w:tcW w:type="dxa" w:w="3916"/>
-          </w:tcPr>
-          <w:p>
-            <w:pPr>
-              <w:pStyle w:val="Compact"/>
-              <w:spacing w:after="40"/>
-              <w:jc w:val="left"/>
-            </w:pPr>
-            <w:r>
-              <w:rPr>
-                <w:sz w:val="20"/>
-              </w:rPr>
-              <w:t xml:space="preserve">Resumo e agradeço</w:t>
+            <w:tcW w:type="dxa" w:w="2519"/>
+          </w:tcPr>
+          <w:p>
+            <w:pPr>
+              <w:pStyle w:val="Compact"/>
+              <w:spacing w:after="40"/>
+              <w:jc w:val="left"/>
+            </w:pPr>
+            <w:r>
+              <w:rPr>
+                <w:sz w:val="20"/>
+              </w:rPr>
+              <w:t xml:space="preserve">Comparação e pergunta</w:t>
+            </w:r>
+          </w:p>
+        </w:tc>
+        <w:tc>
+          <w:tcPr>
+            <w:tcW w:type="dxa" w:w="1716"/>
+          </w:tcPr>
+          <w:p>
+            <w:pPr>
+              <w:pStyle w:val="Compact"/>
+              <w:spacing w:after="40"/>
+              <w:jc w:val="left"/>
+            </w:pPr>
+            <w:r>
+              <w:rPr>
+                <w:sz w:val="20"/>
+              </w:rPr>
+              <w:t xml:space="preserve">12</w:t>
+            </w:r>
+          </w:p>
+        </w:tc>
+        <w:tc>
+          <w:tcPr>
+            <w:tcW w:type="dxa" w:w="1443"/>
+          </w:tcPr>
+          <w:p>
+            <w:pPr>
+              <w:pStyle w:val="Compact"/>
+              <w:spacing w:after="40"/>
+              <w:jc w:val="left"/>
+            </w:pPr>
+            <w:r>
+              <w:rPr>
+                <w:sz w:val="20"/>
+              </w:rPr>
+              <w:t xml:space="preserve">1 min 30 s</w:t>
+            </w:r>
+          </w:p>
+        </w:tc>
+        <w:tc>
+          <w:tcPr>
+            <w:tcW w:type="dxa" w:w="3960"/>
+          </w:tcPr>
+          <w:p>
+            <w:pPr>
+              <w:pStyle w:val="Compact"/>
+              <w:spacing w:after="40"/>
+              <w:jc w:val="left"/>
+            </w:pPr>
+            <w:r>
+              <w:rPr>
+                <w:sz w:val="20"/>
+              </w:rPr>
+              <w:t xml:space="preserve">Comparo os dois tempos e pergunto para a turma</w:t>
             </w:r>
           </w:p>
         </w:tc>
@@ -569,7 +646,81 @@
       <w:tr>
         <w:tc>
           <w:tcPr>
-            <w:tcW w:type="dxa" w:w="2667"/>
+            <w:tcW w:type="dxa" w:w="2519"/>
+          </w:tcPr>
+          <w:p>
+            <w:pPr>
+              <w:pStyle w:val="Compact"/>
+              <w:spacing w:after="40"/>
+              <w:jc w:val="left"/>
+            </w:pPr>
+            <w:r>
+              <w:rPr>
+                <w:sz w:val="20"/>
+              </w:rPr>
+              <w:t xml:space="preserve">Fechamento</w:t>
+            </w:r>
+          </w:p>
+        </w:tc>
+        <w:tc>
+          <w:tcPr>
+            <w:tcW w:type="dxa" w:w="1716"/>
+          </w:tcPr>
+          <w:p>
+            <w:pPr>
+              <w:pStyle w:val="Compact"/>
+              <w:spacing w:after="40"/>
+              <w:jc w:val="left"/>
+            </w:pPr>
+            <w:r>
+              <w:rPr>
+                <w:sz w:val="20"/>
+              </w:rPr>
+              <w:t xml:space="preserve">13</w:t>
+            </w:r>
+          </w:p>
+        </w:tc>
+        <w:tc>
+          <w:tcPr>
+            <w:tcW w:type="dxa" w:w="1443"/>
+          </w:tcPr>
+          <w:p>
+            <w:pPr>
+              <w:pStyle w:val="Compact"/>
+              <w:spacing w:after="40"/>
+              <w:jc w:val="left"/>
+            </w:pPr>
+            <w:r>
+              <w:rPr>
+                <w:sz w:val="20"/>
+              </w:rPr>
+              <w:t xml:space="preserve">30 s</w:t>
+            </w:r>
+          </w:p>
+        </w:tc>
+        <w:tc>
+          <w:tcPr>
+            <w:tcW w:type="dxa" w:w="3960"/>
+          </w:tcPr>
+          <w:p>
+            <w:pPr>
+              <w:pStyle w:val="Compact"/>
+              <w:spacing w:after="40"/>
+              <w:jc w:val="left"/>
+            </w:pPr>
+            <w:r>
+              <w:rPr>
+                <w:sz w:val="20"/>
+              </w:rPr>
+              <w:t xml:space="preserve">Resumo e agradeço</w:t>
+            </w:r>
+          </w:p>
+        </w:tc>
+      </w:tr>
+      <w:tr>
+        <w:tc>
+          <w:tcPr>
+            <w:tcW w:type="dxa" w:w="2519"/>
           </w:tcPr>
           <w:p>
             <w:pPr>
@@ -589,18 +740,18 @@
         </w:tc>
         <w:tc>
           <w:tcPr>
-            <w:tcW w:type="dxa" w:w="1664"/>
-          </w:tcPr>
-          <w:p>
-            <w:pPr>
-              <w:pStyle w:val="Compact"/>
-              <w:spacing w:after="40"/>
-            </w:pPr>
-          </w:p>
-        </w:tc>
-        <w:tc>
-          <w:tcPr>
-            <w:tcW w:type="dxa" w:w="1391"/>
+            <w:tcW w:type="dxa" w:w="1716"/>
+          </w:tcPr>
+          <w:p>
+            <w:pPr>
+              <w:pStyle w:val="Compact"/>
+              <w:spacing w:after="40"/>
+            </w:pPr>
+          </w:p>
+        </w:tc>
+        <w:tc>
+          <w:tcPr>
+            <w:tcW w:type="dxa" w:w="1443"/>
           </w:tcPr>
           <w:p>
             <w:pPr>
@@ -614,13 +765,13 @@
                 <w:b/>
                 <w:sz w:val="20"/>
               </w:rPr>
-              <w:t xml:space="preserve">cerca de 9 min</w:t>
-            </w:r>
-          </w:p>
-        </w:tc>
-        <w:tc>
-          <w:tcPr>
-            <w:tcW w:type="dxa" w:w="3916"/>
+              <w:t xml:space="preserve">cerca de 8 min 30 s</w:t>
+            </w:r>
+          </w:p>
+        </w:tc>
+        <w:tc>
+          <w:tcPr>
+            <w:tcW w:type="dxa" w:w="3960"/>
           </w:tcPr>
           <w:p>
             <w:pPr>
@@ -639,7 +790,7 @@
         <w:rPr>
           <w:rFonts w:ascii="Arial" w:hAnsi="Arial"/>
         </w:rPr>
-        <w:t xml:space="preserve">Se o tempo apertar: resumir a parte de HTML, CSS e JavaScript em 15 segundos.</w:t>
+        <w:t xml:space="preserve">Se o tempo apertar: resumir HTML, CSS e JavaScript em 15 segundos e limitar a parada do cenário 1 a 20 segundos.</w:t>
       </w:r>
     </w:p>
     <w:bookmarkEnd w:id="20"/>
@@ -925,7 +1076,118 @@
         <w:rPr>
           <w:rFonts w:ascii="Arial" w:hAnsi="Arial"/>
         </w:rPr>
-        <w:t xml:space="preserve">☐ Mesa montada: poucas folhas com o operador, folhas extras escondidas com o integrante 3</w:t>
+        <w:t xml:space="preserve">☐ Mesa montada:</w:t>
+      </w:r>
+      <w:r>
+        <w:rPr>
+          <w:rFonts w:ascii="Arial" w:hAnsi="Arial"/>
+        </w:rPr>
+        <w:t xml:space="preserve"> </w:t>
+      </w:r>
+      <w:r>
+        <w:rPr>
+          <w:bCs/>
+          <w:rFonts w:ascii="Arial" w:hAnsi="Arial"/>
+          <w:b/>
+        </w:rPr>
+        <w:t xml:space="preserve">5 folhas</w:t>
+      </w:r>
+      <w:r>
+        <w:rPr>
+          <w:rFonts w:ascii="Arial" w:hAnsi="Arial"/>
+        </w:rPr>
+        <w:t xml:space="preserve"> </w:t>
+      </w:r>
+      <w:r>
+        <w:rPr>
+          <w:rFonts w:ascii="Arial" w:hAnsi="Arial"/>
+        </w:rPr>
+        <w:t xml:space="preserve">com o operador para o cenário 1 e</w:t>
+      </w:r>
+      <w:r>
+        <w:rPr>
+          <w:rFonts w:ascii="Arial" w:hAnsi="Arial"/>
+        </w:rPr>
+        <w:t xml:space="preserve"> </w:t>
+      </w:r>
+      <w:r>
+        <w:rPr>
+          <w:bCs/>
+          <w:rFonts w:ascii="Arial" w:hAnsi="Arial"/>
+          <w:b/>
+        </w:rPr>
+        <w:t xml:space="preserve">mais 5 folhas</w:t>
+      </w:r>
+      <w:r>
+        <w:rPr>
+          <w:rFonts w:ascii="Arial" w:hAnsi="Arial"/>
+        </w:rPr>
+        <w:t xml:space="preserve"> </w:t>
+      </w:r>
+      <w:r>
+        <w:rPr>
+          <w:rFonts w:ascii="Arial" w:hAnsi="Arial"/>
+        </w:rPr>
+        <w:t xml:space="preserve">guardadas com o integrante 3 (servem de reposição no cenário 1 e de novo estoque no cenário 2)</w:t>
+      </w:r>
+    </w:p>
+    <w:p>
+      <w:pPr>
+        <w:numPr>
+          <w:ilvl w:val="0"/>
+          <w:numId w:val="1001"/>
+        </w:numPr>
+        <w:pStyle w:val="Compact"/>
+      </w:pPr>
+      <w:r>
+        <w:rPr>
+          <w:rFonts w:ascii="Arial" w:hAnsi="Arial"/>
+        </w:rPr>
+        <w:t xml:space="preserve">☐ Cronômetro do celular pronto (para o cenário 1)</w:t>
+      </w:r>
+    </w:p>
+    <w:p>
+      <w:pPr>
+        <w:numPr>
+          <w:ilvl w:val="0"/>
+          <w:numId w:val="1001"/>
+        </w:numPr>
+        <w:pStyle w:val="Compact"/>
+      </w:pPr>
+      <w:r>
+        <w:rPr>
+          <w:rFonts w:ascii="Arial" w:hAnsi="Arial"/>
+        </w:rPr>
+        <w:t xml:space="preserve">☐ Combinado com o grupo: no cenário 1, o integrante 3 fica ocupado, longe da mesa, e só vem quando o integrante 2 ou o operador o avisarem. Parada máxima de 30 s.</w:t>
+      </w:r>
+    </w:p>
+    <w:p>
+      <w:pPr>
+        <w:numPr>
+          <w:ilvl w:val="0"/>
+          <w:numId w:val="1001"/>
+        </w:numPr>
+        <w:pStyle w:val="Compact"/>
+      </w:pPr>
+      <w:r>
+        <w:rPr>
+          <w:rFonts w:ascii="Arial" w:hAnsi="Arial"/>
+        </w:rPr>
+        <w:t xml:space="preserve">☐ Simulador:</w:t>
+      </w:r>
+      <w:r>
+        <w:rPr>
+          <w:rFonts w:ascii="Arial" w:hAnsi="Arial"/>
+        </w:rPr>
+        <w:t xml:space="preserve"> </w:t>
+      </w:r>
+      <w:r>
+        <w:rPr>
+          <w:bCs/>
+          <w:rFonts w:ascii="Arial" w:hAnsi="Arial"/>
+          <w:b/>
+        </w:rPr>
+        <w:t xml:space="preserve">não clicar em nada durante o cenário 1</w:t>
       </w:r>
     </w:p>
     <w:bookmarkEnd w:id="21"/>
@@ -1179,7 +1441,7 @@
       </w:tr>
     </w:tbl>
     <w:bookmarkEnd w:id="22"/>
-    <w:bookmarkStart w:id="23" w:name="X563396dee391993b943be45ebcceaae31601279"/>
+    <w:bookmarkStart w:id="23" w:name="X4959b768ef75b6466e9a0b7dc5d6a9d24895751"/>
     <w:p>
       <w:pPr>
         <w:pStyle w:val="Heading2"/>
@@ -1188,7 +1450,7 @@
         <w:rPr>
           <w:rFonts w:ascii="Arial" w:hAnsi="Arial"/>
         </w:rPr>
-        <w:t xml:space="preserve">2. Abertura da prática (slide 10, 40 s)</w:t>
+        <w:t xml:space="preserve">2. Abertura da prática (slide 10, 1 min)</w:t>
       </w:r>
     </w:p>
     <w:p>
@@ -1210,7 +1472,7 @@
         <w:rPr>
           <w:rFonts w:ascii="Arial" w:hAnsi="Arial"/>
         </w:rPr>
-        <w:t xml:space="preserve">"Agora vamos ver o Andon funcionando. Vamos simular uma linha de montagem. O produto é um triângulo de papel. Eu criei este simulador. Ele tem três partes: o HTML cria a estrutura, com campos, botões, painel, torre e histórico. O CSS cuida da aparência: cores, painéis e luzes. O JavaScript faz funcionar: abre os chamados, muda os status, atualiza as luzes e registra o histórico."</w:t>
+        <w:t xml:space="preserve">"Agora vamos ver o Andon funcionando. Vamos simular uma linha de montagem. O produto é um triângulo de papel, e a folha é a nossa matéria-prima. Não importa quantas folhas o operador tenha: uma hora elas vão acabar."</w:t>
       </w:r>
     </w:p>
     <w:p>
@@ -1221,7 +1483,7 @@
         <w:rPr>
           <w:rFonts w:ascii="Arial" w:hAnsi="Arial"/>
         </w:rPr>
-        <w:t xml:space="preserve">"O simulador é didático. Ele registra os chamados. A reposição do papel e a produção serão feitas por nós, aqui na mesa."</w:t>
+        <w:t xml:space="preserve">"Vamos fazer dois cenários com a mesma situação. No primeiro, a folha acaba e a equipe não tem o Andon. No segundo, a folha acaba e a equipe usa o Andon. Em cada um, o operador começa com 5 folhas. No fim, comparamos."</w:t>
       </w:r>
     </w:p>
     <w:p>
@@ -1232,7 +1494,18 @@
         <w:rPr>
           <w:rFonts w:ascii="Arial" w:hAnsi="Arial"/>
         </w:rPr>
-        <w:t xml:space="preserve">"O integrante 1 é o operador. O integrante 2 faz a inspeção. O integrante 3 é a Logística. Eu cuido do simulador."</w:t>
+        <w:t xml:space="preserve">"Eu criei este simulador. O HTML cria a estrutura: campos, botões, painel, torre e histórico. O CSS cuida da aparência: cores e luzes. O JavaScript faz funcionar: abre os chamados, muda os status, atualiza as luzes e registra o histórico. Ele é didático: só registra os chamados. A reposição do papel e a produção são feitas por nós, aqui na mesa."</w:t>
+      </w:r>
+    </w:p>
+    <w:p>
+      <w:pPr>
+        <w:pStyle w:val="BlockText"/>
+      </w:pPr>
+      <w:r>
+        <w:rPr>
+          <w:rFonts w:ascii="Arial" w:hAnsi="Arial"/>
+        </w:rPr>
+        <w:t xml:space="preserve">"O integrante 1 é o operador. O integrante 2 faz a inspeção. O integrante 3 é a Logística. Eu cuido do simulador e do tempo."</w:t>
       </w:r>
     </w:p>
     <w:p>
@@ -1243,7 +1516,7 @@
         <w:rPr>
           <w:rFonts w:ascii="Arial" w:hAnsi="Arial"/>
         </w:rPr>
-        <w:t xml:space="preserve">Troco para a aba do simulador e aponto a torre:</w:t>
+        <w:t xml:space="preserve">Mostro a tela e aponto a torre:</w:t>
       </w:r>
     </w:p>
     <w:p>
@@ -1254,11 +1527,11 @@
         <w:rPr>
           <w:rFonts w:ascii="Arial" w:hAnsi="Arial"/>
         </w:rPr>
-        <w:t xml:space="preserve">"A luz está verde. A produção está normal."</w:t>
+        <w:t xml:space="preserve">"A luz está verde e os contadores estão em zero. Vamos começar pelo cenário sem Andon."</w:t>
       </w:r>
     </w:p>
     <w:bookmarkEnd w:id="23"/>
-    <w:bookmarkStart w:id="24" w:name="Xabd9870403262f812c9e968df48b5eec5f9fdcb"/>
+    <w:bookmarkStart w:id="24" w:name="X423f032d229e8774496d400c79df81e63b3bb65"/>
     <w:p>
       <w:pPr>
         <w:pStyle w:val="Heading2"/>
@@ -1267,7 +1540,18 @@
         <w:rPr>
           <w:rFonts w:ascii="Arial" w:hAnsi="Arial"/>
         </w:rPr>
-        <w:t xml:space="preserve">3. Dinâmica (slide 11 como apoio, tela no simulador, 5 a 6 min)</w:t>
+        <w:t xml:space="preserve">3. Cenário 1: sem Andon (1 min 30 s)</w:t>
+      </w:r>
+    </w:p>
+    <w:p>
+      <w:pPr>
+        <w:pStyle w:val="FirstParagraph"/>
+      </w:pPr>
+      <w:r>
+        <w:rPr>
+          <w:rFonts w:ascii="Arial" w:hAnsi="Arial"/>
+        </w:rPr>
+        <w:t xml:space="preserve">Regra: o simulador fica como está. Não clico em nada.</w:t>
       </w:r>
     </w:p>
     <w:tbl>
@@ -1287,10 +1571,9 @@
         <w:tblLayout w:type="fixed"/>
       </w:tblPr>
       <w:tblGrid>
-        <w:gridCol w:w="1772"/>
-        <w:gridCol w:w="2956"/>
-        <w:gridCol w:w="3587"/>
-        <w:gridCol w:w="1321"/>
+        <w:gridCol w:w="1721"/>
+        <w:gridCol w:w="3828"/>
+        <w:gridCol w:w="4087"/>
       </w:tblGrid>
       <w:tr>
         <w:trPr>
@@ -1298,7 +1581,7 @@
         </w:trPr>
         <w:tc>
           <w:tcPr>
-            <w:tcW w:type="dxa" w:w="1772"/>
+            <w:tcW w:type="dxa" w:w="1722"/>
             <w:shd w:val="clear" w:fill="1F3864"/>
           </w:tcPr>
           <w:p>
@@ -1319,7 +1602,7 @@
         </w:tc>
         <w:tc>
           <w:tcPr>
-            <w:tcW w:type="dxa" w:w="2956"/>
+            <w:tcW w:type="dxa" w:w="3829"/>
             <w:shd w:val="clear" w:fill="1F3864"/>
           </w:tcPr>
           <w:p>
@@ -1340,7 +1623,7 @@
         </w:tc>
         <w:tc>
           <w:tcPr>
-            <w:tcW w:type="dxa" w:w="3588"/>
+            <w:tcW w:type="dxa" w:w="4087"/>
             <w:shd w:val="clear" w:fill="1F3864"/>
           </w:tcPr>
           <w:p>
@@ -1359,32 +1642,11 @@
             </w:r>
           </w:p>
         </w:tc>
-        <w:tc>
-          <w:tcPr>
-            <w:tcW w:type="dxa" w:w="1321"/>
-            <w:shd w:val="clear" w:fill="1F3864"/>
-          </w:tcPr>
-          <w:p>
-            <w:pPr>
-              <w:pStyle w:val="Compact"/>
-              <w:spacing w:after="40"/>
-              <w:jc w:val="left"/>
-            </w:pPr>
-            <w:r>
-              <w:rPr>
-                <w:b/>
-                <w:color w:val="FFFFFF"/>
-                <w:sz w:val="20"/>
-              </w:rPr>
-              <w:t xml:space="preserve">Luz</w:t>
-            </w:r>
-          </w:p>
-        </w:tc>
       </w:tr>
       <w:tr>
         <w:tc>
           <w:tcPr>
-            <w:tcW w:type="dxa" w:w="1772"/>
+            <w:tcW w:type="dxa" w:w="1722"/>
           </w:tcPr>
           <w:p>
             <w:pPr>
@@ -1402,55 +1664,37 @@
         </w:tc>
         <w:tc>
           <w:tcPr>
-            <w:tcW w:type="dxa" w:w="2956"/>
-          </w:tcPr>
-          <w:p>
-            <w:pPr>
-              <w:pStyle w:val="Compact"/>
-              <w:spacing w:after="40"/>
-              <w:jc w:val="left"/>
-            </w:pPr>
-            <w:r>
-              <w:rPr>
-                <w:sz w:val="20"/>
-              </w:rPr>
-              <w:t xml:space="preserve">Int. 1 dobra, Int. 2 confere. Eu não clico.</w:t>
-            </w:r>
-          </w:p>
-        </w:tc>
-        <w:tc>
-          <w:tcPr>
-            <w:tcW w:type="dxa" w:w="3588"/>
-          </w:tcPr>
-          <w:p>
-            <w:pPr>
-              <w:pStyle w:val="Compact"/>
-              <w:spacing w:after="40"/>
-              <w:jc w:val="left"/>
-            </w:pPr>
-            <w:r>
-              <w:rPr>
-                <w:sz w:val="20"/>
-              </w:rPr>
-              <w:t xml:space="preserve">"Nossa linha está funcionando normalmente. O operador monta. A inspeção confere. Até que ocorre uma situação que impede a produção."</w:t>
-            </w:r>
-          </w:p>
-        </w:tc>
-        <w:tc>
-          <w:tcPr>
-            <w:tcW w:type="dxa" w:w="1321"/>
-          </w:tcPr>
-          <w:p>
-            <w:pPr>
-              <w:pStyle w:val="Compact"/>
-              <w:spacing w:after="40"/>
-              <w:jc w:val="left"/>
-            </w:pPr>
-            <w:r>
-              <w:rPr>
-                <w:sz w:val="20"/>
-              </w:rPr>
-              <w:t xml:space="preserve">Verde</w:t>
+            <w:tcW w:type="dxa" w:w="3829"/>
+          </w:tcPr>
+          <w:p>
+            <w:pPr>
+              <w:pStyle w:val="Compact"/>
+              <w:spacing w:after="40"/>
+              <w:jc w:val="left"/>
+            </w:pPr>
+            <w:r>
+              <w:rPr>
+                <w:sz w:val="20"/>
+              </w:rPr>
+              <w:t xml:space="preserve">Int. 1 dobra os triângulos com as 5 folhas. Int. 2 confere. Int. 3 está ocupado, afastado da mesa.</w:t>
+            </w:r>
+          </w:p>
+        </w:tc>
+        <w:tc>
+          <w:tcPr>
+            <w:tcW w:type="dxa" w:w="4087"/>
+          </w:tcPr>
+          <w:p>
+            <w:pPr>
+              <w:pStyle w:val="Compact"/>
+              <w:spacing w:after="40"/>
+              <w:jc w:val="left"/>
+            </w:pPr>
+            <w:r>
+              <w:rPr>
+                <w:sz w:val="20"/>
+              </w:rPr>
+              <w:t xml:space="preserve">"Cenário 1, sem Andon. A linha trabalha normalmente. O operador monta, a inspeção confere."</w:t>
             </w:r>
           </w:p>
         </w:tc>
@@ -1458,73 +1702,81 @@
       <w:tr>
         <w:tc>
           <w:tcPr>
-            <w:tcW w:type="dxa" w:w="1772"/>
-          </w:tcPr>
-          <w:p>
-            <w:pPr>
-              <w:pStyle w:val="Compact"/>
-              <w:spacing w:after="40"/>
-              <w:jc w:val="left"/>
-            </w:pPr>
-            <w:r>
-              <w:rPr>
-                <w:sz w:val="20"/>
-              </w:rPr>
-              <w:t xml:space="preserve">2. Problema</w:t>
-            </w:r>
-          </w:p>
-        </w:tc>
-        <w:tc>
-          <w:tcPr>
-            <w:tcW w:type="dxa" w:w="2956"/>
-          </w:tcPr>
-          <w:p>
-            <w:pPr>
-              <w:pStyle w:val="Compact"/>
-              <w:spacing w:after="40"/>
-              <w:jc w:val="left"/>
-            </w:pPr>
-            <w:r>
-              <w:rPr>
-                <w:sz w:val="20"/>
-              </w:rPr>
-              <w:t xml:space="preserve">Papel acaba. Int. 1 levanta a mão: "Atenção! Estamos sem papel na estação de montagem. Não consigo continuar a produção."</w:t>
-            </w:r>
-          </w:p>
-        </w:tc>
-        <w:tc>
-          <w:tcPr>
-            <w:tcW w:type="dxa" w:w="3588"/>
-          </w:tcPr>
-          <w:p>
-            <w:pPr>
-              <w:pStyle w:val="Compact"/>
-              <w:spacing w:after="40"/>
-              <w:jc w:val="left"/>
-            </w:pPr>
-            <w:r>
-              <w:rPr>
-                <w:sz w:val="20"/>
-              </w:rPr>
-              <w:t xml:space="preserve">"O operador parou a linha. Ele não pode resolver sozinho. Precisa chamar quem abastece. Como ele faz isso? Aqui entra o Andon."</w:t>
-            </w:r>
-          </w:p>
-        </w:tc>
-        <w:tc>
-          <w:tcPr>
-            <w:tcW w:type="dxa" w:w="1321"/>
-          </w:tcPr>
-          <w:p>
-            <w:pPr>
-              <w:pStyle w:val="Compact"/>
-              <w:spacing w:after="40"/>
-              <w:jc w:val="left"/>
-            </w:pPr>
-            <w:r>
-              <w:rPr>
-                <w:sz w:val="20"/>
-              </w:rPr>
-              <w:t xml:space="preserve">Verde</w:t>
+            <w:tcW w:type="dxa" w:w="1722"/>
+          </w:tcPr>
+          <w:p>
+            <w:pPr>
+              <w:pStyle w:val="Compact"/>
+              <w:spacing w:after="40"/>
+              <w:jc w:val="left"/>
+            </w:pPr>
+            <w:r>
+              <w:rPr>
+                <w:sz w:val="20"/>
+              </w:rPr>
+              <w:t xml:space="preserve">2. Folhas acabam</w:t>
+            </w:r>
+          </w:p>
+        </w:tc>
+        <w:tc>
+          <w:tcPr>
+            <w:tcW w:type="dxa" w:w="3829"/>
+          </w:tcPr>
+          <w:p>
+            <w:pPr>
+              <w:pStyle w:val="Compact"/>
+              <w:spacing w:after="40"/>
+              <w:jc w:val="left"/>
+            </w:pPr>
+            <w:r>
+              <w:rPr>
+                <w:sz w:val="20"/>
+              </w:rPr>
+              <w:t xml:space="preserve">Int. 1 para e diz: "Acabou o papel." Sem ferramenta, ele só pode esperar ou procurar alguém.</w:t>
+            </w:r>
+          </w:p>
+        </w:tc>
+        <w:tc>
+          <w:tcPr>
+            <w:tcW w:type="dxa" w:w="4087"/>
+          </w:tcPr>
+          <w:p>
+            <w:pPr>
+              <w:pStyle w:val="Compact"/>
+              <w:spacing w:after="40"/>
+              <w:jc w:val="left"/>
+            </w:pPr>
+            <w:r>
+              <w:rPr>
+                <w:sz w:val="20"/>
+              </w:rPr>
+              <w:t xml:space="preserve">"Acabou o papel.</w:t>
+            </w:r>
+            <w:r>
+              <w:rPr>
+                <w:sz w:val="20"/>
+              </w:rPr>
+              <w:t xml:space="preserve"> </w:t>
+            </w:r>
+            <w:r>
+              <w:rPr>
+                <w:bCs/>
+                <w:b/>
+                <w:sz w:val="20"/>
+              </w:rPr>
+              <w:t xml:space="preserve">Disparo o cronômetro.</w:t>
+            </w:r>
+            <w:r>
+              <w:rPr>
+                <w:sz w:val="20"/>
+              </w:rPr>
+              <w:t xml:space="preserve"> </w:t>
+            </w:r>
+            <w:r>
+              <w:rPr>
+                <w:sz w:val="20"/>
+              </w:rPr>
+              <w:t xml:space="preserve">O operador não tem como avisar quem abastece. A luz do simulador continua verde e nada está registrado." (aponto a tela)</w:t>
             </w:r>
           </w:p>
         </w:tc>
@@ -1532,295 +1784,131 @@
       <w:tr>
         <w:tc>
           <w:tcPr>
-            <w:tcW w:type="dxa" w:w="1772"/>
-          </w:tcPr>
-          <w:p>
-            <w:pPr>
-              <w:pStyle w:val="Compact"/>
-              <w:spacing w:after="40"/>
-              <w:jc w:val="left"/>
-            </w:pPr>
-            <w:r>
-              <w:rPr>
-                <w:sz w:val="20"/>
-              </w:rPr>
-              <w:t xml:space="preserve">3. Acionamento</w:t>
-            </w:r>
-          </w:p>
-        </w:tc>
-        <w:tc>
-          <w:tcPr>
-            <w:tcW w:type="dxa" w:w="2956"/>
-          </w:tcPr>
-          <w:p>
-            <w:pPr>
-              <w:pStyle w:val="Compact"/>
-              <w:spacing w:after="40"/>
-              <w:jc w:val="left"/>
-            </w:pPr>
+            <w:tcW w:type="dxa" w:w="1722"/>
+          </w:tcPr>
+          <w:p>
+            <w:pPr>
+              <w:pStyle w:val="Compact"/>
+              <w:spacing w:after="40"/>
+              <w:jc w:val="left"/>
+            </w:pPr>
+            <w:r>
+              <w:rPr>
+                <w:sz w:val="20"/>
+              </w:rPr>
+              <w:t xml:space="preserve">3. Alguém percebe</w:t>
+            </w:r>
+          </w:p>
+        </w:tc>
+        <w:tc>
+          <w:tcPr>
+            <w:tcW w:type="dxa" w:w="3829"/>
+          </w:tcPr>
+          <w:p>
+            <w:pPr>
+              <w:pStyle w:val="Compact"/>
+              <w:spacing w:after="40"/>
+              <w:jc w:val="left"/>
+            </w:pPr>
+            <w:r>
+              <w:rPr>
+                <w:sz w:val="20"/>
+              </w:rPr>
+              <w:t xml:space="preserve">Int. 2 nota que não chegam triângulos e vai avisar o Int. 3 (ou o operador sai do posto para procurá-lo). Limite: 30 s.</w:t>
+            </w:r>
+          </w:p>
+        </w:tc>
+        <w:tc>
+          <w:tcPr>
+            <w:tcW w:type="dxa" w:w="4087"/>
+          </w:tcPr>
+          <w:p>
+            <w:pPr>
+              <w:pStyle w:val="Compact"/>
+              <w:spacing w:after="40"/>
+              <w:jc w:val="left"/>
+            </w:pPr>
+            <w:r>
+              <w:rPr>
+                <w:sz w:val="20"/>
+              </w:rPr>
+              <w:t xml:space="preserve">"Repare: a linha está parada e quem abastece ainda não sabe. A informação anda de boca em boca, no tempo de cada um."</w:t>
+            </w:r>
+          </w:p>
+        </w:tc>
+      </w:tr>
+      <w:tr>
+        <w:tc>
+          <w:tcPr>
+            <w:tcW w:type="dxa" w:w="1722"/>
+          </w:tcPr>
+          <w:p>
+            <w:pPr>
+              <w:pStyle w:val="Compact"/>
+              <w:spacing w:after="40"/>
+              <w:jc w:val="left"/>
+            </w:pPr>
+            <w:r>
+              <w:rPr>
+                <w:sz w:val="20"/>
+              </w:rPr>
+              <w:t xml:space="preserve">4. Reposição</w:t>
+            </w:r>
+          </w:p>
+        </w:tc>
+        <w:tc>
+          <w:tcPr>
+            <w:tcW w:type="dxa" w:w="3829"/>
+          </w:tcPr>
+          <w:p>
+            <w:pPr>
+              <w:pStyle w:val="Compact"/>
+              <w:spacing w:after="40"/>
+              <w:jc w:val="left"/>
+            </w:pPr>
+            <w:r>
+              <w:rPr>
+                <w:sz w:val="20"/>
+              </w:rPr>
+              <w:t xml:space="preserve">Int. 3 traz o papel. Int. 1 retoma a montagem.</w:t>
+            </w:r>
+          </w:p>
+        </w:tc>
+        <w:tc>
+          <w:tcPr>
+            <w:tcW w:type="dxa" w:w="4087"/>
+          </w:tcPr>
+          <w:p>
+            <w:pPr>
+              <w:pStyle w:val="Compact"/>
+              <w:spacing w:after="40"/>
+              <w:jc w:val="left"/>
+            </w:pPr>
+            <w:r>
+              <w:rPr>
+                <w:sz w:val="20"/>
+              </w:rPr>
+              <w:t xml:space="preserve">"Papel chegou.</w:t>
+            </w:r>
+            <w:r>
+              <w:rPr>
+                <w:sz w:val="20"/>
+              </w:rPr>
+              <w:t xml:space="preserve"> </w:t>
+            </w:r>
             <w:r>
               <w:rPr>
                 <w:bCs/>
                 <w:b/>
                 <w:sz w:val="20"/>
               </w:rPr>
-              <w:t xml:space="preserve">Eu</w:t>
-            </w:r>
-            <w:r>
-              <w:rPr>
-                <w:sz w:val="20"/>
-              </w:rPr>
-              <w:t xml:space="preserve"> </w:t>
-            </w:r>
-            <w:r>
-              <w:rPr>
-                <w:sz w:val="20"/>
-              </w:rPr>
-              <w:t xml:space="preserve">leio os campos em voz alta e clico em</w:t>
-            </w:r>
-            <w:r>
-              <w:rPr>
-                <w:sz w:val="20"/>
-              </w:rPr>
-              <w:t xml:space="preserve"> </w:t>
-            </w:r>
-            <w:r>
-              <w:rPr>
-                <w:bCs/>
-                <w:b/>
-                <w:sz w:val="20"/>
-              </w:rPr>
-              <w:t xml:space="preserve">"Enviar chamado"</w:t>
-            </w:r>
-          </w:p>
-        </w:tc>
-        <w:tc>
-          <w:tcPr>
-            <w:tcW w:type="dxa" w:w="3588"/>
-          </w:tcPr>
-          <w:p>
-            <w:pPr>
-              <w:pStyle w:val="Compact"/>
-              <w:spacing w:after="40"/>
-              <w:jc w:val="left"/>
-            </w:pPr>
-            <w:r>
-              <w:rPr>
-                <w:sz w:val="20"/>
-              </w:rPr>
-              <w:t xml:space="preserve">"O chamado foi enviado. A luz ficou vermelha: ocorrência aberta. O som avisa quem está por perto. O chamado foi direto para a Logística. O painel mostra o chamado aberto e o histórico registrou a ocorrência." (aponto luz, contador e painel)</w:t>
-            </w:r>
-          </w:p>
-        </w:tc>
-        <w:tc>
-          <w:tcPr>
-            <w:tcW w:type="dxa" w:w="1321"/>
-          </w:tcPr>
-          <w:p>
-            <w:pPr>
-              <w:pStyle w:val="Compact"/>
-              <w:spacing w:after="40"/>
-              <w:jc w:val="left"/>
-            </w:pPr>
-            <w:r>
-              <w:rPr>
-                <w:sz w:val="20"/>
-              </w:rPr>
-              <w:t xml:space="preserve">Vermelha</w:t>
-            </w:r>
-          </w:p>
-        </w:tc>
-      </w:tr>
-      <w:tr>
-        <w:tc>
-          <w:tcPr>
-            <w:tcW w:type="dxa" w:w="1772"/>
-          </w:tcPr>
-          <w:p>
-            <w:pPr>
-              <w:pStyle w:val="Compact"/>
-              <w:spacing w:after="40"/>
-              <w:jc w:val="left"/>
-            </w:pPr>
-            <w:r>
-              <w:rPr>
-                <w:sz w:val="20"/>
-              </w:rPr>
-              <w:t xml:space="preserve">4. Atendimento</w:t>
-            </w:r>
-          </w:p>
-        </w:tc>
-        <w:tc>
-          <w:tcPr>
-            <w:tcW w:type="dxa" w:w="2956"/>
-          </w:tcPr>
-          <w:p>
-            <w:pPr>
-              <w:pStyle w:val="Compact"/>
-              <w:spacing w:after="40"/>
-              <w:jc w:val="left"/>
-            </w:pPr>
-            <w:r>
-              <w:rPr>
-                <w:sz w:val="20"/>
-              </w:rPr>
-              <w:t xml:space="preserve">Int. 3 clica em</w:t>
-            </w:r>
-            <w:r>
-              <w:rPr>
-                <w:sz w:val="20"/>
-              </w:rPr>
-              <w:t xml:space="preserve"> </w:t>
-            </w:r>
-            <w:r>
-              <w:rPr>
-                <w:bCs/>
-                <w:b/>
-                <w:sz w:val="20"/>
-              </w:rPr>
-              <w:t xml:space="preserve">"Assumir chamado"</w:t>
-            </w:r>
-            <w:r>
-              <w:rPr>
-                <w:sz w:val="20"/>
-              </w:rPr>
-              <w:t xml:space="preserve"> </w:t>
-            </w:r>
-            <w:r>
-              <w:rPr>
-                <w:sz w:val="20"/>
-              </w:rPr>
-              <w:t xml:space="preserve">e leva o papel. Fala: "Recebemos o chamado, identificamos a falta de material e realizamos a reposição para que a produção possa continuar."</w:t>
-            </w:r>
-          </w:p>
-        </w:tc>
-        <w:tc>
-          <w:tcPr>
-            <w:tcW w:type="dxa" w:w="3588"/>
-          </w:tcPr>
-          <w:p>
-            <w:pPr>
-              <w:pStyle w:val="Compact"/>
-              <w:spacing w:after="40"/>
-              <w:jc w:val="left"/>
-            </w:pPr>
-            <w:r>
-              <w:rPr>
-                <w:sz w:val="20"/>
-              </w:rPr>
-              <w:t xml:space="preserve">"A Logística recebeu o chamado e assumiu o atendimento. A luz ficou amarela: equipe em atendimento."</w:t>
-            </w:r>
-          </w:p>
-        </w:tc>
-        <w:tc>
-          <w:tcPr>
-            <w:tcW w:type="dxa" w:w="1321"/>
-          </w:tcPr>
-          <w:p>
-            <w:pPr>
-              <w:pStyle w:val="Compact"/>
-              <w:spacing w:after="40"/>
-              <w:jc w:val="left"/>
-            </w:pPr>
-            <w:r>
-              <w:rPr>
-                <w:sz w:val="20"/>
-              </w:rPr>
-              <w:t xml:space="preserve">Amarela</w:t>
-            </w:r>
-          </w:p>
-        </w:tc>
-      </w:tr>
-      <w:tr>
-        <w:tc>
-          <w:tcPr>
-            <w:tcW w:type="dxa" w:w="1772"/>
-          </w:tcPr>
-          <w:p>
-            <w:pPr>
-              <w:pStyle w:val="Compact"/>
-              <w:spacing w:after="40"/>
-              <w:jc w:val="left"/>
-            </w:pPr>
-            <w:r>
-              <w:rPr>
-                <w:sz w:val="20"/>
-              </w:rPr>
-              <w:t xml:space="preserve">5. Resolução</w:t>
-            </w:r>
-          </w:p>
-        </w:tc>
-        <w:tc>
-          <w:tcPr>
-            <w:tcW w:type="dxa" w:w="2956"/>
-          </w:tcPr>
-          <w:p>
-            <w:pPr>
-              <w:pStyle w:val="Compact"/>
-              <w:spacing w:after="40"/>
-              <w:jc w:val="left"/>
-            </w:pPr>
-            <w:r>
-              <w:rPr>
-                <w:sz w:val="20"/>
-              </w:rPr>
-              <w:t xml:space="preserve">Int. 1 volta a montar, Int. 2 a inspecionar. Int. 3 clica em</w:t>
-            </w:r>
-            <w:r>
-              <w:rPr>
-                <w:sz w:val="20"/>
-              </w:rPr>
-              <w:t xml:space="preserve"> </w:t>
-            </w:r>
-            <w:r>
-              <w:rPr>
-                <w:bCs/>
-                <w:b/>
-                <w:sz w:val="20"/>
-              </w:rPr>
-              <w:t xml:space="preserve">"Marcar resolvido"</w:t>
-            </w:r>
-            <w:r>
-              <w:rPr>
-                <w:sz w:val="20"/>
-              </w:rPr>
-              <w:t xml:space="preserve">.</w:t>
-            </w:r>
-          </w:p>
-        </w:tc>
-        <w:tc>
-          <w:tcPr>
-            <w:tcW w:type="dxa" w:w="3588"/>
-          </w:tcPr>
-          <w:p>
-            <w:pPr>
-              <w:pStyle w:val="Compact"/>
-              <w:spacing w:after="40"/>
-              <w:jc w:val="left"/>
-            </w:pPr>
-            <w:r>
-              <w:rPr>
-                <w:sz w:val="20"/>
-              </w:rPr>
-              <w:t xml:space="preserve">"Com o problema resolvido, a produção foi retomada. A luz voltou ao verde. O histórico registrou quanto tempo levou, do chamado até a solução." (leio o tempo)</w:t>
-            </w:r>
-          </w:p>
-        </w:tc>
-        <w:tc>
-          <w:tcPr>
-            <w:tcW w:type="dxa" w:w="1321"/>
-          </w:tcPr>
-          <w:p>
-            <w:pPr>
-              <w:pStyle w:val="Compact"/>
-              <w:spacing w:after="40"/>
-              <w:jc w:val="left"/>
-            </w:pPr>
-            <w:r>
-              <w:rPr>
-                <w:sz w:val="20"/>
-              </w:rPr>
-              <w:t xml:space="preserve">Verde</w:t>
+              <w:t xml:space="preserve">Paro o cronômetro.</w:t>
+            </w:r>
+            <w:r>
+              <w:rPr>
+                <w:sz w:val="20"/>
+              </w:rPr>
+              <w:t xml:space="preserve">"</w:t>
             </w:r>
           </w:p>
         </w:tc>
@@ -1834,7 +1922,18 @@
         <w:rPr>
           <w:rFonts w:ascii="Arial" w:hAnsi="Arial"/>
         </w:rPr>
-        <w:t xml:space="preserve">Atenção: "Acionar Andon" só abre o formulário. O chamado só é aberto em</w:t>
+        <w:t xml:space="preserve">Fecho o cenário:</w:t>
+      </w:r>
+    </w:p>
+    <w:p>
+      <w:pPr>
+        <w:pStyle w:val="BlockText"/>
+      </w:pPr>
+      <w:r>
+        <w:rPr>
+          <w:rFonts w:ascii="Arial" w:hAnsi="Arial"/>
+        </w:rPr>
+        <w:t xml:space="preserve">"A linha ficou parada</w:t>
       </w:r>
       <w:r>
         <w:rPr>
@@ -1848,17 +1947,28 @@
           <w:rFonts w:ascii="Arial" w:hAnsi="Arial"/>
           <w:b/>
         </w:rPr>
-        <w:t xml:space="preserve">"Enviar chamado"</w:t>
-      </w:r>
-      <w:r>
-        <w:rPr>
-          <w:rFonts w:ascii="Arial" w:hAnsi="Arial"/>
-        </w:rPr>
-        <w:t xml:space="preserve">.</w:t>
+        <w:t xml:space="preserve">X segundos</w:t>
+      </w:r>
+      <w:r>
+        <w:rPr>
+          <w:rFonts w:ascii="Arial" w:hAnsi="Arial"/>
+        </w:rPr>
+        <w:t xml:space="preserve">. Quem abasteceu só soube porque alguém foi avisar. E o simulador continua zerado: nenhum registro, nenhuma informação para melhorar depois."</w:t>
+      </w:r>
+    </w:p>
+    <w:p>
+      <w:pPr>
+        <w:pStyle w:val="FirstParagraph"/>
+      </w:pPr>
+      <w:r>
+        <w:rPr>
+          <w:rFonts w:ascii="Arial" w:hAnsi="Arial"/>
+        </w:rPr>
+        <w:t xml:space="preserve">Anoto o tempo (X) para comparar. Em seguida o grupo se prepara para o cenário 2: o operador pega mais 5 folhas, o Int. 3 volta para o posto da Logística e eu confiro se o formulário continua preenchido.</w:t>
       </w:r>
     </w:p>
     <w:bookmarkEnd w:id="24"/>
-    <w:bookmarkStart w:id="25" w:name="X72963115ba5444ec961b7bb002ba310d5620166"/>
+    <w:bookmarkStart w:id="25" w:name="Xb8ef8b5cc83c24ad8dac6f4f1658a959e6cf9b4"/>
     <w:p>
       <w:pPr>
         <w:pStyle w:val="Heading2"/>
@@ -1867,7 +1977,7 @@
         <w:rPr>
           <w:rFonts w:ascii="Arial" w:hAnsi="Arial"/>
         </w:rPr>
-        <w:t xml:space="preserve">4. Pergunta para a turma (slide 12, 1 min)</w:t>
+        <w:t xml:space="preserve">4. Cenário 2: com Andon (slide 11 como apoio, 2 min 30 s)</w:t>
       </w:r>
     </w:p>
     <w:p>
@@ -1878,88 +1988,7 @@
         <w:rPr>
           <w:rFonts w:ascii="Arial" w:hAnsi="Arial"/>
         </w:rPr>
-        <w:t xml:space="preserve">"O que poderia acontecer se o operador não tivesse como sinalizar essa falta de material?"</w:t>
-      </w:r>
-    </w:p>
-    <w:p>
-      <w:pPr>
-        <w:pStyle w:val="FirstParagraph"/>
-      </w:pPr>
-      <w:r>
-        <w:rPr>
-          <w:rFonts w:ascii="Arial" w:hAnsi="Arial"/>
-        </w:rPr>
-        <w:t xml:space="preserve">Conto até 5 em silêncio. Aceito 2 ou 3 respostas. Se ninguém responder: "Pensem na fábrica de vocês. Se ninguém avisa, quem fica sabendo?"</w:t>
-      </w:r>
-    </w:p>
-    <w:p>
-      <w:pPr>
-        <w:pStyle w:val="BodyText"/>
-      </w:pPr>
-      <w:r>
-        <w:rPr>
-          <w:rFonts w:ascii="Arial" w:hAnsi="Arial"/>
-        </w:rPr>
-        <w:t xml:space="preserve">Complemento:</w:t>
-      </w:r>
-    </w:p>
-    <w:p>
-      <w:pPr>
-        <w:pStyle w:val="BlockText"/>
-      </w:pPr>
-      <w:r>
-        <w:rPr>
-          <w:rFonts w:ascii="Arial" w:hAnsi="Arial"/>
-        </w:rPr>
-        <w:t xml:space="preserve">"Isso mesmo. Sem sinalização, o problema demora mais a ser percebido. O tempo de parada aumenta. Os produtos incompletos se acumulam. Tudo isso gera atraso."</w:t>
-      </w:r>
-    </w:p>
-    <w:bookmarkEnd w:id="25"/>
-    <w:bookmarkStart w:id="26" w:name="X447a6ba45d70b31a3d610126aba8cfb809c19cc"/>
-    <w:p>
-      <w:pPr>
-        <w:pStyle w:val="Heading2"/>
-      </w:pPr>
-      <w:r>
-        <w:rPr>
-          <w:rFonts w:ascii="Arial" w:hAnsi="Arial"/>
-        </w:rPr>
-        <w:t xml:space="preserve">5. Fechamento (slide 13, 30 s)</w:t>
-      </w:r>
-    </w:p>
-    <w:p>
-      <w:pPr>
-        <w:pStyle w:val="BlockText"/>
-      </w:pPr>
-      <w:r>
-        <w:rPr>
-          <w:rFonts w:ascii="Arial" w:hAnsi="Arial"/>
-        </w:rPr>
-        <w:t xml:space="preserve">"Essa dinâmica mostrou que o Andon não resolve o problema sozinho. A função dele é sinalizar a ocorrência, facilitar a comunicação e direcionar o chamado para o setor certo. Assim a equipe age mais rápido e reduz o impacto na produção."</w:t>
-      </w:r>
-    </w:p>
-    <w:p>
-      <w:pPr>
-        <w:pStyle w:val="BlockText"/>
-      </w:pPr>
-      <w:r>
-        <w:rPr>
-          <w:rFonts w:ascii="Arial" w:hAnsi="Arial"/>
-        </w:rPr>
-        <w:t xml:space="preserve">"Para funcionar, a equipe precisa saber três coisas: quando acionar, quem deve responder e como registrar e resolver. Obrigado. Alguma pergunta?"</w:t>
-      </w:r>
-    </w:p>
-    <w:bookmarkEnd w:id="26"/>
-    <w:bookmarkStart w:id="27" w:name="plano-b"/>
-    <w:p>
-      <w:pPr>
-        <w:pStyle w:val="Heading2"/>
-      </w:pPr>
-      <w:r>
-        <w:rPr>
-          <w:rFonts w:ascii="Arial" w:hAnsi="Arial"/>
-        </w:rPr>
-        <w:t xml:space="preserve">Plano B</w:t>
+        <w:t xml:space="preserve">"Cenário 2, com Andon. Mesma situação, agora com a ferramenta."</w:t>
       </w:r>
     </w:p>
     <w:tbl>
@@ -1979,8 +2008,10 @@
         <w:tblLayout w:type="fixed"/>
       </w:tblPr>
       <w:tblGrid>
-        <w:gridCol w:w="2952"/>
-        <w:gridCol w:w="6685"/>
+        <w:gridCol w:w="1783"/>
+        <w:gridCol w:w="3069"/>
+        <w:gridCol w:w="3462"/>
+        <w:gridCol w:w="1321"/>
       </w:tblGrid>
       <w:tr>
         <w:trPr>
@@ -1988,7 +2019,7 @@
         </w:trPr>
         <w:tc>
           <w:tcPr>
-            <w:tcW w:type="dxa" w:w="2953"/>
+            <w:tcW w:type="dxa" w:w="1784"/>
             <w:shd w:val="clear" w:fill="1F3864"/>
           </w:tcPr>
           <w:p>
@@ -2003,13 +2034,13 @@
                 <w:color w:val="FFFFFF"/>
                 <w:sz w:val="20"/>
               </w:rPr>
-              <w:t xml:space="preserve">Problema</w:t>
-            </w:r>
-          </w:p>
-        </w:tc>
-        <w:tc>
-          <w:tcPr>
-            <w:tcW w:type="dxa" w:w="6685"/>
+              <w:t xml:space="preserve">Etapa</w:t>
+            </w:r>
+          </w:p>
+        </w:tc>
+        <w:tc>
+          <w:tcPr>
+            <w:tcW w:type="dxa" w:w="3070"/>
             <w:shd w:val="clear" w:fill="1F3864"/>
           </w:tcPr>
           <w:p>
@@ -2024,7 +2055,49 @@
                 <w:color w:val="FFFFFF"/>
                 <w:sz w:val="20"/>
               </w:rPr>
-              <w:t xml:space="preserve">O que fazer</w:t>
+              <w:t xml:space="preserve">Quem age</w:t>
+            </w:r>
+          </w:p>
+        </w:tc>
+        <w:tc>
+          <w:tcPr>
+            <w:tcW w:type="dxa" w:w="3462"/>
+            <w:shd w:val="clear" w:fill="1F3864"/>
+          </w:tcPr>
+          <w:p>
+            <w:pPr>
+              <w:pStyle w:val="Compact"/>
+              <w:spacing w:after="40"/>
+              <w:jc w:val="left"/>
+            </w:pPr>
+            <w:r>
+              <w:rPr>
+                <w:b/>
+                <w:color w:val="FFFFFF"/>
+                <w:sz w:val="20"/>
+              </w:rPr>
+              <w:t xml:space="preserve">Eu falo</w:t>
+            </w:r>
+          </w:p>
+        </w:tc>
+        <w:tc>
+          <w:tcPr>
+            <w:tcW w:type="dxa" w:w="1322"/>
+            <w:shd w:val="clear" w:fill="1F3864"/>
+          </w:tcPr>
+          <w:p>
+            <w:pPr>
+              <w:pStyle w:val="Compact"/>
+              <w:spacing w:after="40"/>
+              <w:jc w:val="left"/>
+            </w:pPr>
+            <w:r>
+              <w:rPr>
+                <w:b/>
+                <w:color w:val="FFFFFF"/>
+                <w:sz w:val="20"/>
+              </w:rPr>
+              <w:t xml:space="preserve">Luz</w:t>
             </w:r>
           </w:p>
         </w:tc>
@@ -2032,37 +2105,73 @@
       <w:tr>
         <w:tc>
           <w:tcPr>
-            <w:tcW w:type="dxa" w:w="2953"/>
-          </w:tcPr>
-          <w:p>
-            <w:pPr>
-              <w:pStyle w:val="Compact"/>
-              <w:spacing w:after="40"/>
-              <w:jc w:val="left"/>
-            </w:pPr>
-            <w:r>
-              <w:rPr>
-                <w:sz w:val="20"/>
-              </w:rPr>
-              <w:t xml:space="preserve">Som não toca</w:t>
-            </w:r>
-          </w:p>
-        </w:tc>
-        <w:tc>
-          <w:tcPr>
-            <w:tcW w:type="dxa" w:w="6685"/>
-          </w:tcPr>
-          <w:p>
-            <w:pPr>
-              <w:pStyle w:val="Compact"/>
-              <w:spacing w:after="40"/>
-              <w:jc w:val="left"/>
-            </w:pPr>
-            <w:r>
-              <w:rPr>
-                <w:sz w:val="20"/>
-              </w:rPr>
-              <w:t xml:space="preserve">Seguir. "O alerta sonoro faz parte do sistema, mas o visual já mostra a ocorrência."</w:t>
+            <w:tcW w:type="dxa" w:w="1784"/>
+          </w:tcPr>
+          <w:p>
+            <w:pPr>
+              <w:pStyle w:val="Compact"/>
+              <w:spacing w:after="40"/>
+              <w:jc w:val="left"/>
+            </w:pPr>
+            <w:r>
+              <w:rPr>
+                <w:sz w:val="20"/>
+              </w:rPr>
+              <w:t xml:space="preserve">1. Produção</w:t>
+            </w:r>
+          </w:p>
+        </w:tc>
+        <w:tc>
+          <w:tcPr>
+            <w:tcW w:type="dxa" w:w="3070"/>
+          </w:tcPr>
+          <w:p>
+            <w:pPr>
+              <w:pStyle w:val="Compact"/>
+              <w:spacing w:after="40"/>
+              <w:jc w:val="left"/>
+            </w:pPr>
+            <w:r>
+              <w:rPr>
+                <w:sz w:val="20"/>
+              </w:rPr>
+              <w:t xml:space="preserve">Int. 1 dobra com as 5 folhas novas, Int. 2 confere. Eu não clico.</w:t>
+            </w:r>
+          </w:p>
+        </w:tc>
+        <w:tc>
+          <w:tcPr>
+            <w:tcW w:type="dxa" w:w="3462"/>
+          </w:tcPr>
+          <w:p>
+            <w:pPr>
+              <w:pStyle w:val="Compact"/>
+              <w:spacing w:after="40"/>
+              <w:jc w:val="left"/>
+            </w:pPr>
+            <w:r>
+              <w:rPr>
+                <w:sz w:val="20"/>
+              </w:rPr>
+              <w:t xml:space="preserve">"A linha trabalha normalmente. A luz está verde."</w:t>
+            </w:r>
+          </w:p>
+        </w:tc>
+        <w:tc>
+          <w:tcPr>
+            <w:tcW w:type="dxa" w:w="1322"/>
+          </w:tcPr>
+          <w:p>
+            <w:pPr>
+              <w:pStyle w:val="Compact"/>
+              <w:spacing w:after="40"/>
+              <w:jc w:val="left"/>
+            </w:pPr>
+            <w:r>
+              <w:rPr>
+                <w:sz w:val="20"/>
+              </w:rPr>
+              <w:t xml:space="preserve">Verde</w:t>
             </w:r>
           </w:p>
         </w:tc>
@@ -2070,37 +2179,73 @@
       <w:tr>
         <w:tc>
           <w:tcPr>
-            <w:tcW w:type="dxa" w:w="2953"/>
-          </w:tcPr>
-          <w:p>
-            <w:pPr>
-              <w:pStyle w:val="Compact"/>
-              <w:spacing w:after="40"/>
-              <w:jc w:val="left"/>
-            </w:pPr>
-            <w:r>
-              <w:rPr>
-                <w:sz w:val="20"/>
-              </w:rPr>
-              <w:t xml:space="preserve">Cliquei errado</w:t>
-            </w:r>
-          </w:p>
-        </w:tc>
-        <w:tc>
-          <w:tcPr>
-            <w:tcW w:type="dxa" w:w="6685"/>
-          </w:tcPr>
-          <w:p>
-            <w:pPr>
-              <w:pStyle w:val="Compact"/>
-              <w:spacing w:after="40"/>
-              <w:jc w:val="left"/>
-            </w:pPr>
-            <w:r>
-              <w:rPr>
-                <w:sz w:val="20"/>
-              </w:rPr>
-              <w:t xml:space="preserve">"Reiniciar demonstração", preencher de novo. "Vamos repetir o registro."</w:t>
+            <w:tcW w:type="dxa" w:w="1784"/>
+          </w:tcPr>
+          <w:p>
+            <w:pPr>
+              <w:pStyle w:val="Compact"/>
+              <w:spacing w:after="40"/>
+              <w:jc w:val="left"/>
+            </w:pPr>
+            <w:r>
+              <w:rPr>
+                <w:sz w:val="20"/>
+              </w:rPr>
+              <w:t xml:space="preserve">2. Folhas acabam</w:t>
+            </w:r>
+          </w:p>
+        </w:tc>
+        <w:tc>
+          <w:tcPr>
+            <w:tcW w:type="dxa" w:w="3070"/>
+          </w:tcPr>
+          <w:p>
+            <w:pPr>
+              <w:pStyle w:val="Compact"/>
+              <w:spacing w:after="40"/>
+              <w:jc w:val="left"/>
+            </w:pPr>
+            <w:r>
+              <w:rPr>
+                <w:sz w:val="20"/>
+              </w:rPr>
+              <w:t xml:space="preserve">Int. 1 levanta a mão: "Atenção! Estamos sem papel na estação de montagem. Não consigo continuar a produção."</w:t>
+            </w:r>
+          </w:p>
+        </w:tc>
+        <w:tc>
+          <w:tcPr>
+            <w:tcW w:type="dxa" w:w="3462"/>
+          </w:tcPr>
+          <w:p>
+            <w:pPr>
+              <w:pStyle w:val="Compact"/>
+              <w:spacing w:after="40"/>
+              <w:jc w:val="left"/>
+            </w:pPr>
+            <w:r>
+              <w:rPr>
+                <w:sz w:val="20"/>
+              </w:rPr>
+              <w:t xml:space="preserve">"O operador parou a linha. Ele não resolve sozinho. Precisa chamar quem abastece. Aqui entra o Andon."</w:t>
+            </w:r>
+          </w:p>
+        </w:tc>
+        <w:tc>
+          <w:tcPr>
+            <w:tcW w:type="dxa" w:w="1322"/>
+          </w:tcPr>
+          <w:p>
+            <w:pPr>
+              <w:pStyle w:val="Compact"/>
+              <w:spacing w:after="40"/>
+              <w:jc w:val="left"/>
+            </w:pPr>
+            <w:r>
+              <w:rPr>
+                <w:sz w:val="20"/>
+              </w:rPr>
+              <w:t xml:space="preserve">Verde</w:t>
             </w:r>
           </w:p>
         </w:tc>
@@ -2108,37 +2253,159 @@
       <w:tr>
         <w:tc>
           <w:tcPr>
-            <w:tcW w:type="dxa" w:w="2953"/>
-          </w:tcPr>
-          <w:p>
-            <w:pPr>
-              <w:pStyle w:val="Compact"/>
-              <w:spacing w:after="40"/>
-              <w:jc w:val="left"/>
-            </w:pPr>
-            <w:r>
-              <w:rPr>
-                <w:sz w:val="20"/>
-              </w:rPr>
-              <w:t xml:space="preserve">Papel não acabou na hora</w:t>
-            </w:r>
-          </w:p>
-        </w:tc>
-        <w:tc>
-          <w:tcPr>
-            <w:tcW w:type="dxa" w:w="6685"/>
-          </w:tcPr>
-          <w:p>
-            <w:pPr>
-              <w:pStyle w:val="Compact"/>
-              <w:spacing w:after="40"/>
-              <w:jc w:val="left"/>
-            </w:pPr>
-            <w:r>
-              <w:rPr>
-                <w:sz w:val="20"/>
-              </w:rPr>
-              <w:t xml:space="preserve">O operador finge a falta e diz a fala.</w:t>
+            <w:tcW w:type="dxa" w:w="1784"/>
+          </w:tcPr>
+          <w:p>
+            <w:pPr>
+              <w:pStyle w:val="Compact"/>
+              <w:spacing w:after="40"/>
+              <w:jc w:val="left"/>
+            </w:pPr>
+            <w:r>
+              <w:rPr>
+                <w:sz w:val="20"/>
+              </w:rPr>
+              <w:t xml:space="preserve">3. Acionamento</w:t>
+            </w:r>
+          </w:p>
+        </w:tc>
+        <w:tc>
+          <w:tcPr>
+            <w:tcW w:type="dxa" w:w="3070"/>
+          </w:tcPr>
+          <w:p>
+            <w:pPr>
+              <w:pStyle w:val="Compact"/>
+              <w:spacing w:after="40"/>
+              <w:jc w:val="left"/>
+            </w:pPr>
+            <w:r>
+              <w:rPr>
+                <w:bCs/>
+                <w:b/>
+                <w:sz w:val="20"/>
+              </w:rPr>
+              <w:t xml:space="preserve">Eu</w:t>
+            </w:r>
+            <w:r>
+              <w:rPr>
+                <w:sz w:val="20"/>
+              </w:rPr>
+              <w:t xml:space="preserve"> </w:t>
+            </w:r>
+            <w:r>
+              <w:rPr>
+                <w:sz w:val="20"/>
+              </w:rPr>
+              <w:t xml:space="preserve">leio os campos e clico em</w:t>
+            </w:r>
+            <w:r>
+              <w:rPr>
+                <w:sz w:val="20"/>
+              </w:rPr>
+              <w:t xml:space="preserve"> </w:t>
+            </w:r>
+            <w:r>
+              <w:rPr>
+                <w:bCs/>
+                <w:b/>
+                <w:sz w:val="20"/>
+              </w:rPr>
+              <w:t xml:space="preserve">"Enviar chamado"</w:t>
+            </w:r>
+            <w:r>
+              <w:rPr>
+                <w:sz w:val="20"/>
+              </w:rPr>
+              <w:t xml:space="preserve"> </w:t>
+            </w:r>
+            <w:r>
+              <w:rPr>
+                <w:sz w:val="20"/>
+              </w:rPr>
+              <w:t xml:space="preserve">(</w:t>
+            </w:r>
+            <w:r>
+              <w:rPr>
+                <w:bCs/>
+                <w:b/>
+                <w:sz w:val="20"/>
+              </w:rPr>
+              <w:t xml:space="preserve">disparo o cronômetro</w:t>
+            </w:r>
+            <w:r>
+              <w:rPr>
+                <w:sz w:val="20"/>
+              </w:rPr>
+              <w:t xml:space="preserve"> </w:t>
+            </w:r>
+            <w:r>
+              <w:rPr>
+                <w:sz w:val="20"/>
+              </w:rPr>
+              <w:t xml:space="preserve">junto com o clique)</w:t>
+            </w:r>
+          </w:p>
+        </w:tc>
+        <w:tc>
+          <w:tcPr>
+            <w:tcW w:type="dxa" w:w="3462"/>
+          </w:tcPr>
+          <w:p>
+            <w:pPr>
+              <w:pStyle w:val="Compact"/>
+              <w:spacing w:after="40"/>
+              <w:jc w:val="left"/>
+            </w:pPr>
+            <w:r>
+              <w:rPr>
+                <w:sz w:val="20"/>
+              </w:rPr>
+              <w:t xml:space="preserve">"Posto de montagem P-03. Falta de material. Prioridade alta. Responsável: Logística. Descrição: falta de papel na estação de montagem, produção parada." Depois do clique: "A luz ficou vermelha: ocorrência aberta. O som avisa quem está por perto. O chamado foi</w:t>
+            </w:r>
+            <w:r>
+              <w:rPr>
+                <w:sz w:val="20"/>
+              </w:rPr>
+              <w:t xml:space="preserve"> </w:t>
+            </w:r>
+            <w:r>
+              <w:rPr>
+                <w:bCs/>
+                <w:b/>
+                <w:sz w:val="20"/>
+              </w:rPr>
+              <w:t xml:space="preserve">direto</w:t>
+            </w:r>
+            <w:r>
+              <w:rPr>
+                <w:sz w:val="20"/>
+              </w:rPr>
+              <w:t xml:space="preserve"> </w:t>
+            </w:r>
+            <w:r>
+              <w:rPr>
+                <w:sz w:val="20"/>
+              </w:rPr>
+              <w:t xml:space="preserve">para a Logística. O painel mostra o chamado e o histórico registrou."</w:t>
+            </w:r>
+          </w:p>
+        </w:tc>
+        <w:tc>
+          <w:tcPr>
+            <w:tcW w:type="dxa" w:w="1322"/>
+          </w:tcPr>
+          <w:p>
+            <w:pPr>
+              <w:pStyle w:val="Compact"/>
+              <w:spacing w:after="40"/>
+              <w:jc w:val="left"/>
+            </w:pPr>
+            <w:r>
+              <w:rPr>
+                <w:sz w:val="20"/>
+              </w:rPr>
+              <w:t xml:space="preserve">Vermelha</w:t>
             </w:r>
           </w:p>
         </w:tc>
@@ -2146,37 +2413,99 @@
       <w:tr>
         <w:tc>
           <w:tcPr>
-            <w:tcW w:type="dxa" w:w="2953"/>
-          </w:tcPr>
-          <w:p>
-            <w:pPr>
-              <w:pStyle w:val="Compact"/>
-              <w:spacing w:after="40"/>
-              <w:jc w:val="left"/>
-            </w:pPr>
-            <w:r>
-              <w:rPr>
-                <w:sz w:val="20"/>
-              </w:rPr>
-              <w:t xml:space="preserve">Turma não responde</w:t>
-            </w:r>
-          </w:p>
-        </w:tc>
-        <w:tc>
-          <w:tcPr>
-            <w:tcW w:type="dxa" w:w="6685"/>
-          </w:tcPr>
-          <w:p>
-            <w:pPr>
-              <w:pStyle w:val="Compact"/>
-              <w:spacing w:after="40"/>
-              <w:jc w:val="left"/>
-            </w:pPr>
-            <w:r>
-              <w:rPr>
-                <w:sz w:val="20"/>
-              </w:rPr>
-              <w:t xml:space="preserve">Reformular a pergunta (ver bloco 4).</w:t>
+            <w:tcW w:type="dxa" w:w="1784"/>
+          </w:tcPr>
+          <w:p>
+            <w:pPr>
+              <w:pStyle w:val="Compact"/>
+              <w:spacing w:after="40"/>
+              <w:jc w:val="left"/>
+            </w:pPr>
+            <w:r>
+              <w:rPr>
+                <w:sz w:val="20"/>
+              </w:rPr>
+              <w:t xml:space="preserve">4. Atendimento</w:t>
+            </w:r>
+          </w:p>
+        </w:tc>
+        <w:tc>
+          <w:tcPr>
+            <w:tcW w:type="dxa" w:w="3070"/>
+          </w:tcPr>
+          <w:p>
+            <w:pPr>
+              <w:pStyle w:val="Compact"/>
+              <w:spacing w:after="40"/>
+              <w:jc w:val="left"/>
+            </w:pPr>
+            <w:r>
+              <w:rPr>
+                <w:sz w:val="20"/>
+              </w:rPr>
+              <w:t xml:space="preserve">Int. 3 clica em</w:t>
+            </w:r>
+            <w:r>
+              <w:rPr>
+                <w:sz w:val="20"/>
+              </w:rPr>
+              <w:t xml:space="preserve"> </w:t>
+            </w:r>
+            <w:r>
+              <w:rPr>
+                <w:bCs/>
+                <w:b/>
+                <w:sz w:val="20"/>
+              </w:rPr>
+              <w:t xml:space="preserve">"Assumir chamado"</w:t>
+            </w:r>
+            <w:r>
+              <w:rPr>
+                <w:sz w:val="20"/>
+              </w:rPr>
+              <w:t xml:space="preserve"> </w:t>
+            </w:r>
+            <w:r>
+              <w:rPr>
+                <w:sz w:val="20"/>
+              </w:rPr>
+              <w:t xml:space="preserve">e leva o papel. Fala: "Recebemos o chamado, identificamos a falta de material e realizamos a reposição para que a produção possa continuar."</w:t>
+            </w:r>
+          </w:p>
+        </w:tc>
+        <w:tc>
+          <w:tcPr>
+            <w:tcW w:type="dxa" w:w="3462"/>
+          </w:tcPr>
+          <w:p>
+            <w:pPr>
+              <w:pStyle w:val="Compact"/>
+              <w:spacing w:after="40"/>
+              <w:jc w:val="left"/>
+            </w:pPr>
+            <w:r>
+              <w:rPr>
+                <w:sz w:val="20"/>
+              </w:rPr>
+              <w:t xml:space="preserve">"A Logística assumiu. A luz ficou amarela: equipe em atendimento."</w:t>
+            </w:r>
+          </w:p>
+        </w:tc>
+        <w:tc>
+          <w:tcPr>
+            <w:tcW w:type="dxa" w:w="1322"/>
+          </w:tcPr>
+          <w:p>
+            <w:pPr>
+              <w:pStyle w:val="Compact"/>
+              <w:spacing w:after="40"/>
+              <w:jc w:val="left"/>
+            </w:pPr>
+            <w:r>
+              <w:rPr>
+                <w:sz w:val="20"/>
+              </w:rPr>
+              <w:t xml:space="preserve">Amarela</w:t>
             </w:r>
           </w:p>
         </w:tc>
@@ -2184,44 +2513,298 @@
       <w:tr>
         <w:tc>
           <w:tcPr>
-            <w:tcW w:type="dxa" w:w="2953"/>
-          </w:tcPr>
-          <w:p>
-            <w:pPr>
-              <w:pStyle w:val="Compact"/>
-              <w:spacing w:after="40"/>
-              <w:jc w:val="left"/>
-            </w:pPr>
-            <w:r>
-              <w:rPr>
-                <w:sz w:val="20"/>
-              </w:rPr>
-              <w:t xml:space="preserve">Int. 3 esquece de clicar</w:t>
-            </w:r>
-          </w:p>
-        </w:tc>
-        <w:tc>
-          <w:tcPr>
-            <w:tcW w:type="dxa" w:w="6685"/>
-          </w:tcPr>
-          <w:p>
-            <w:pPr>
-              <w:pStyle w:val="Compact"/>
-              <w:spacing w:after="40"/>
-              <w:jc w:val="left"/>
-            </w:pPr>
-            <w:r>
-              <w:rPr>
-                <w:sz w:val="20"/>
-              </w:rPr>
-              <w:t xml:space="preserve">Eu clico no lugar dele, sem pausa.</w:t>
+            <w:tcW w:type="dxa" w:w="1784"/>
+          </w:tcPr>
+          <w:p>
+            <w:pPr>
+              <w:pStyle w:val="Compact"/>
+              <w:spacing w:after="40"/>
+              <w:jc w:val="left"/>
+            </w:pPr>
+            <w:r>
+              <w:rPr>
+                <w:sz w:val="20"/>
+              </w:rPr>
+              <w:t xml:space="preserve">5. Resolução</w:t>
+            </w:r>
+          </w:p>
+        </w:tc>
+        <w:tc>
+          <w:tcPr>
+            <w:tcW w:type="dxa" w:w="3070"/>
+          </w:tcPr>
+          <w:p>
+            <w:pPr>
+              <w:pStyle w:val="Compact"/>
+              <w:spacing w:after="40"/>
+              <w:jc w:val="left"/>
+            </w:pPr>
+            <w:r>
+              <w:rPr>
+                <w:sz w:val="20"/>
+              </w:rPr>
+              <w:t xml:space="preserve">Int. 1 retoma a montagem. Int. 2 volta a inspecionar. Int. 3 clica em</w:t>
+            </w:r>
+            <w:r>
+              <w:rPr>
+                <w:sz w:val="20"/>
+              </w:rPr>
+              <w:t xml:space="preserve"> </w:t>
+            </w:r>
+            <w:r>
+              <w:rPr>
+                <w:bCs/>
+                <w:b/>
+                <w:sz w:val="20"/>
+              </w:rPr>
+              <w:t xml:space="preserve">"Marcar resolvido"</w:t>
+            </w:r>
+            <w:r>
+              <w:rPr>
+                <w:sz w:val="20"/>
+              </w:rPr>
+              <w:t xml:space="preserve">.</w:t>
+            </w:r>
+          </w:p>
+        </w:tc>
+        <w:tc>
+          <w:tcPr>
+            <w:tcW w:type="dxa" w:w="3462"/>
+          </w:tcPr>
+          <w:p>
+            <w:pPr>
+              <w:pStyle w:val="Compact"/>
+              <w:spacing w:after="40"/>
+              <w:jc w:val="left"/>
+            </w:pPr>
+            <w:r>
+              <w:rPr>
+                <w:sz w:val="20"/>
+              </w:rPr>
+              <w:t xml:space="preserve">"A produção foi retomada. A luz voltou ao verde. O histórico registrou quanto tempo levou, do chamado até a solução." (leio o tempo do simulador)</w:t>
+            </w:r>
+          </w:p>
+        </w:tc>
+        <w:tc>
+          <w:tcPr>
+            <w:tcW w:type="dxa" w:w="1322"/>
+          </w:tcPr>
+          <w:p>
+            <w:pPr>
+              <w:pStyle w:val="Compact"/>
+              <w:spacing w:after="40"/>
+              <w:jc w:val="left"/>
+            </w:pPr>
+            <w:r>
+              <w:rPr>
+                <w:sz w:val="20"/>
+              </w:rPr>
+              <w:t xml:space="preserve">Verde</w:t>
             </w:r>
           </w:p>
         </w:tc>
       </w:tr>
     </w:tbl>
+    <w:p>
+      <w:pPr>
+        <w:pStyle w:val="BodyText"/>
+      </w:pPr>
+      <w:r>
+        <w:rPr>
+          <w:rFonts w:ascii="Arial" w:hAnsi="Arial"/>
+        </w:rPr>
+        <w:t xml:space="preserve">Atenção: "Acionar Andon" só abre o formulário. O chamado só é aberto em</w:t>
+      </w:r>
+      <w:r>
+        <w:rPr>
+          <w:rFonts w:ascii="Arial" w:hAnsi="Arial"/>
+        </w:rPr>
+        <w:t xml:space="preserve"> </w:t>
+      </w:r>
+      <w:r>
+        <w:rPr>
+          <w:bCs/>
+          <w:rFonts w:ascii="Arial" w:hAnsi="Arial"/>
+          <w:b/>
+        </w:rPr>
+        <w:t xml:space="preserve">"Enviar chamado"</w:t>
+      </w:r>
+      <w:r>
+        <w:rPr>
+          <w:rFonts w:ascii="Arial" w:hAnsi="Arial"/>
+        </w:rPr>
+        <w:t xml:space="preserve">.</w:t>
+      </w:r>
+    </w:p>
+    <w:bookmarkEnd w:id="25"/>
+    <w:bookmarkStart w:id="26" w:name="X93ce655aff0655bb58507a25478af979f52fbea"/>
+    <w:p>
+      <w:pPr>
+        <w:pStyle w:val="Heading2"/>
+      </w:pPr>
+      <w:r>
+        <w:rPr>
+          <w:rFonts w:ascii="Arial" w:hAnsi="Arial"/>
+        </w:rPr>
+        <w:t xml:space="preserve">5. Comparação e pergunta para a turma (slide 12, 1 min 30 s)</w:t>
+      </w:r>
+    </w:p>
+    <w:p>
+      <w:pPr>
+        <w:pStyle w:val="FirstParagraph"/>
+      </w:pPr>
+      <w:r>
+        <w:rPr>
+          <w:rFonts w:ascii="Arial" w:hAnsi="Arial"/>
+        </w:rPr>
+        <w:t xml:space="preserve">Comparo os dois cenários (se der, mostro os números nos dedos ou digo em voz alta):</w:t>
+      </w:r>
+    </w:p>
+    <w:p>
+      <w:pPr>
+        <w:pStyle w:val="BlockText"/>
+      </w:pPr>
+      <w:r>
+        <w:rPr>
+          <w:rFonts w:ascii="Arial" w:hAnsi="Arial"/>
+        </w:rPr>
+        <w:t xml:space="preserve">"No cenário 1, a linha ficou parada X segundos, quem abastece só soube por aviso, e não ficou nenhum registro. No cenário 2, o tempo foi Y segundos, o chamado foi direto para a Logística, e o histórico guardou a ocorrência."</w:t>
+      </w:r>
+    </w:p>
+    <w:p>
+      <w:pPr>
+        <w:pStyle w:val="FirstParagraph"/>
+      </w:pPr>
+      <w:r>
+        <w:rPr>
+          <w:rFonts w:ascii="Arial" w:hAnsi="Arial"/>
+        </w:rPr>
+        <w:t xml:space="preserve">Pergunta:</w:t>
+      </w:r>
+    </w:p>
+    <w:p>
+      <w:pPr>
+        <w:pStyle w:val="BlockText"/>
+      </w:pPr>
+      <w:r>
+        <w:rPr>
+          <w:rFonts w:ascii="Arial" w:hAnsi="Arial"/>
+        </w:rPr>
+        <w:t xml:space="preserve">"Pensando nos dois cenários: o que mudou, e o que aconteceria se isso se repetisse todo dia em uma fábrica de verdade?"</w:t>
+      </w:r>
+    </w:p>
+    <w:p>
+      <w:pPr>
+        <w:pStyle w:val="FirstParagraph"/>
+      </w:pPr>
+      <w:r>
+        <w:rPr>
+          <w:rFonts w:ascii="Arial" w:hAnsi="Arial"/>
+        </w:rPr>
+        <w:t xml:space="preserve">Conto até 5 em silêncio. Aceito 2 ou 3 respostas. Se ninguém responder: "Pensem na fábrica de vocês. Se ninguém avisa, quem fica sabendo?"</w:t>
+      </w:r>
+    </w:p>
+    <w:p>
+      <w:pPr>
+        <w:pStyle w:val="BodyText"/>
+      </w:pPr>
+      <w:r>
+        <w:rPr>
+          <w:rFonts w:ascii="Arial" w:hAnsi="Arial"/>
+        </w:rPr>
+        <w:t xml:space="preserve">Complemento:</w:t>
+      </w:r>
+    </w:p>
+    <w:p>
+      <w:pPr>
+        <w:pStyle w:val="BlockText"/>
+      </w:pPr>
+      <w:r>
+        <w:rPr>
+          <w:rFonts w:ascii="Arial" w:hAnsi="Arial"/>
+        </w:rPr>
+        <w:t xml:space="preserve">"Isso mesmo. Sem sinalização, o problema demora mais a ser percebido, o tempo de parada aumenta e os produtos incompletos se acumulam. Com o Andon, a informação vai direto ao responsável e fica registrada. Isso gera atraso a menos e dados para melhorar."</w:t>
+      </w:r>
+    </w:p>
+    <w:p>
+      <w:pPr>
+        <w:pStyle w:val="FirstParagraph"/>
+      </w:pPr>
+      <w:r>
+        <w:rPr>
+          <w:rFonts w:ascii="Arial" w:hAnsi="Arial"/>
+        </w:rPr>
+        <w:t xml:space="preserve">Se os tempos ficarem parecidos (por exemplo, o grupo estava perto da mesa):</w:t>
+      </w:r>
+    </w:p>
+    <w:p>
+      <w:pPr>
+        <w:pStyle w:val="BlockText"/>
+      </w:pPr>
+      <w:r>
+        <w:rPr>
+          <w:rFonts w:ascii="Arial" w:hAnsi="Arial"/>
+        </w:rPr>
+        <w:t xml:space="preserve">"Aqui a mesa é pequena e a Logística estava a um passo. Em uma fábrica grande, a distância e o número de pessoas fazem a diferença crescer. O ganho do Andon é a</w:t>
+      </w:r>
+      <w:r>
+        <w:rPr>
+          <w:rFonts w:ascii="Arial" w:hAnsi="Arial"/>
+        </w:rPr>
+        <w:t xml:space="preserve"> </w:t>
+      </w:r>
+      <w:r>
+        <w:rPr>
+          <w:bCs/>
+          <w:rFonts w:ascii="Arial" w:hAnsi="Arial"/>
+          <w:b/>
+        </w:rPr>
+        <w:t xml:space="preserve">velocidade, o destino certo do chamado e o registro</w:t>
+      </w:r>
+      <w:r>
+        <w:rPr>
+          <w:rFonts w:ascii="Arial" w:hAnsi="Arial"/>
+        </w:rPr>
+        <w:t xml:space="preserve">."</w:t>
+      </w:r>
+    </w:p>
+    <w:bookmarkEnd w:id="26"/>
+    <w:bookmarkStart w:id="27" w:name="X557b84676f6015cce3a5cad70c7642c192c5f6e"/>
+    <w:p>
+      <w:pPr>
+        <w:pStyle w:val="Heading2"/>
+      </w:pPr>
+      <w:r>
+        <w:rPr>
+          <w:rFonts w:ascii="Arial" w:hAnsi="Arial"/>
+        </w:rPr>
+        <w:t xml:space="preserve">6. Fechamento (slide 13, 30 s)</w:t>
+      </w:r>
+    </w:p>
+    <w:p>
+      <w:pPr>
+        <w:pStyle w:val="BlockText"/>
+      </w:pPr>
+      <w:r>
+        <w:rPr>
+          <w:rFonts w:ascii="Arial" w:hAnsi="Arial"/>
+        </w:rPr>
+        <w:t xml:space="preserve">"Os dois cenários mostraram que o Andon não resolve o problema sozinho. A função dele é sinalizar a ocorrência, facilitar a comunicação e direcionar o chamado para o setor certo. Assim a equipe age mais rápido e reduz o impacto na produção."</w:t>
+      </w:r>
+    </w:p>
+    <w:p>
+      <w:pPr>
+        <w:pStyle w:val="BlockText"/>
+      </w:pPr>
+      <w:r>
+        <w:rPr>
+          <w:rFonts w:ascii="Arial" w:hAnsi="Arial"/>
+        </w:rPr>
+        <w:t xml:space="preserve">"Para funcionar, a equipe precisa saber três coisas: quando acionar, quem deve responder e como registrar e resolver. Obrigado. Alguma pergunta?"</w:t>
+      </w:r>
+    </w:p>
     <w:bookmarkEnd w:id="27"/>
-    <w:bookmarkStart w:id="28" w:name="prova-oral-respostas-curtas"/>
+    <w:bookmarkStart w:id="28" w:name="plano-b"/>
     <w:p>
       <w:pPr>
         <w:pStyle w:val="Heading2"/>
@@ -2230,7 +2813,7 @@
         <w:rPr>
           <w:rFonts w:ascii="Arial" w:hAnsi="Arial"/>
         </w:rPr>
-        <w:t xml:space="preserve">Prova oral: respostas curtas</w:t>
+        <w:t xml:space="preserve">Plano B</w:t>
       </w:r>
     </w:p>
     <w:tbl>
@@ -2250,8 +2833,8 @@
         <w:tblLayout w:type="fixed"/>
       </w:tblPr>
       <w:tblGrid>
-        <w:gridCol w:w="2986"/>
-        <w:gridCol w:w="6651"/>
+        <w:gridCol w:w="3091"/>
+        <w:gridCol w:w="6546"/>
       </w:tblGrid>
       <w:tr>
         <w:trPr>
@@ -2259,7 +2842,7 @@
         </w:trPr>
         <w:tc>
           <w:tcPr>
-            <w:tcW w:type="dxa" w:w="2986"/>
+            <w:tcW w:type="dxa" w:w="3091"/>
             <w:shd w:val="clear" w:fill="1F3864"/>
           </w:tcPr>
           <w:p>
@@ -2274,13 +2857,13 @@
                 <w:color w:val="FFFFFF"/>
                 <w:sz w:val="20"/>
               </w:rPr>
-              <w:t xml:space="preserve">Pergunta</w:t>
-            </w:r>
-          </w:p>
-        </w:tc>
-        <w:tc>
-          <w:tcPr>
-            <w:tcW w:type="dxa" w:w="6652"/>
+              <w:t xml:space="preserve">Problema</w:t>
+            </w:r>
+          </w:p>
+        </w:tc>
+        <w:tc>
+          <w:tcPr>
+            <w:tcW w:type="dxa" w:w="6547"/>
             <w:shd w:val="clear" w:fill="1F3864"/>
           </w:tcPr>
           <w:p>
@@ -2295,7 +2878,7 @@
                 <w:color w:val="FFFFFF"/>
                 <w:sz w:val="20"/>
               </w:rPr>
-              <w:t xml:space="preserve">Resposta</w:t>
+              <w:t xml:space="preserve">O que fazer</w:t>
             </w:r>
           </w:p>
         </w:tc>
@@ -2303,37 +2886,37 @@
       <w:tr>
         <w:tc>
           <w:tcPr>
-            <w:tcW w:type="dxa" w:w="2986"/>
-          </w:tcPr>
-          <w:p>
-            <w:pPr>
-              <w:pStyle w:val="Compact"/>
-              <w:spacing w:after="40"/>
-              <w:jc w:val="left"/>
-            </w:pPr>
-            <w:r>
-              <w:rPr>
-                <w:sz w:val="20"/>
-              </w:rPr>
-              <w:t xml:space="preserve">O que é Andon?</w:t>
-            </w:r>
-          </w:p>
-        </w:tc>
-        <w:tc>
-          <w:tcPr>
-            <w:tcW w:type="dxa" w:w="6652"/>
-          </w:tcPr>
-          <w:p>
-            <w:pPr>
-              <w:pStyle w:val="Compact"/>
-              <w:spacing w:after="40"/>
-              <w:jc w:val="left"/>
-            </w:pPr>
-            <w:r>
-              <w:rPr>
-                <w:sz w:val="20"/>
-              </w:rPr>
-              <w:t xml:space="preserve">Ferramenta de gestão visual que sinaliza anormalidades e chama ajuda.</w:t>
+            <w:tcW w:type="dxa" w:w="3091"/>
+          </w:tcPr>
+          <w:p>
+            <w:pPr>
+              <w:pStyle w:val="Compact"/>
+              <w:spacing w:after="40"/>
+              <w:jc w:val="left"/>
+            </w:pPr>
+            <w:r>
+              <w:rPr>
+                <w:sz w:val="20"/>
+              </w:rPr>
+              <w:t xml:space="preserve">Som não toca</w:t>
+            </w:r>
+          </w:p>
+        </w:tc>
+        <w:tc>
+          <w:tcPr>
+            <w:tcW w:type="dxa" w:w="6547"/>
+          </w:tcPr>
+          <w:p>
+            <w:pPr>
+              <w:pStyle w:val="Compact"/>
+              <w:spacing w:after="40"/>
+              <w:jc w:val="left"/>
+            </w:pPr>
+            <w:r>
+              <w:rPr>
+                <w:sz w:val="20"/>
+              </w:rPr>
+              <w:t xml:space="preserve">Seguir. "O alerta sonoro faz parte do sistema, mas o visual já mostra a ocorrência."</w:t>
             </w:r>
           </w:p>
         </w:tc>
@@ -2341,37 +2924,37 @@
       <w:tr>
         <w:tc>
           <w:tcPr>
-            <w:tcW w:type="dxa" w:w="2986"/>
-          </w:tcPr>
-          <w:p>
-            <w:pPr>
-              <w:pStyle w:val="Compact"/>
-              <w:spacing w:after="40"/>
-              <w:jc w:val="left"/>
-            </w:pPr>
-            <w:r>
-              <w:rPr>
-                <w:sz w:val="20"/>
-              </w:rPr>
-              <w:t xml:space="preserve">Origem?</w:t>
-            </w:r>
-          </w:p>
-        </w:tc>
-        <w:tc>
-          <w:tcPr>
-            <w:tcW w:type="dxa" w:w="6652"/>
-          </w:tcPr>
-          <w:p>
-            <w:pPr>
-              <w:pStyle w:val="Compact"/>
-              <w:spacing w:after="40"/>
-              <w:jc w:val="left"/>
-            </w:pPr>
-            <w:r>
-              <w:rPr>
-                <w:sz w:val="20"/>
-              </w:rPr>
-              <w:t xml:space="preserve">Sistema Toyota de Produção. Antecedente: tear automático de Sakichi Toyoda, que parava quando o fio quebrava.</w:t>
+            <w:tcW w:type="dxa" w:w="3091"/>
+          </w:tcPr>
+          <w:p>
+            <w:pPr>
+              <w:pStyle w:val="Compact"/>
+              <w:spacing w:after="40"/>
+              <w:jc w:val="left"/>
+            </w:pPr>
+            <w:r>
+              <w:rPr>
+                <w:sz w:val="20"/>
+              </w:rPr>
+              <w:t xml:space="preserve">Cliquei errado</w:t>
+            </w:r>
+          </w:p>
+        </w:tc>
+        <w:tc>
+          <w:tcPr>
+            <w:tcW w:type="dxa" w:w="6547"/>
+          </w:tcPr>
+          <w:p>
+            <w:pPr>
+              <w:pStyle w:val="Compact"/>
+              <w:spacing w:after="40"/>
+              <w:jc w:val="left"/>
+            </w:pPr>
+            <w:r>
+              <w:rPr>
+                <w:sz w:val="20"/>
+              </w:rPr>
+              <w:t xml:space="preserve">"Reiniciar demonstração", preencher de novo. "Vamos repetir o registro."</w:t>
             </w:r>
           </w:p>
         </w:tc>
@@ -2379,37 +2962,37 @@
       <w:tr>
         <w:tc>
           <w:tcPr>
-            <w:tcW w:type="dxa" w:w="2986"/>
-          </w:tcPr>
-          <w:p>
-            <w:pPr>
-              <w:pStyle w:val="Compact"/>
-              <w:spacing w:after="40"/>
-              <w:jc w:val="left"/>
-            </w:pPr>
-            <w:r>
-              <w:rPr>
-                <w:sz w:val="20"/>
-              </w:rPr>
-              <w:t xml:space="preserve">Sempre para a linha?</w:t>
-            </w:r>
-          </w:p>
-        </w:tc>
-        <w:tc>
-          <w:tcPr>
-            <w:tcW w:type="dxa" w:w="6652"/>
-          </w:tcPr>
-          <w:p>
-            <w:pPr>
-              <w:pStyle w:val="Compact"/>
-              <w:spacing w:after="40"/>
-              <w:jc w:val="left"/>
-            </w:pPr>
-            <w:r>
-              <w:rPr>
-                <w:sz w:val="20"/>
-              </w:rPr>
-              <w:t xml:space="preserve">Não. Depende da regra do processo e da gravidade.</w:t>
+            <w:tcW w:type="dxa" w:w="3091"/>
+          </w:tcPr>
+          <w:p>
+            <w:pPr>
+              <w:pStyle w:val="Compact"/>
+              <w:spacing w:after="40"/>
+              <w:jc w:val="left"/>
+            </w:pPr>
+            <w:r>
+              <w:rPr>
+                <w:sz w:val="20"/>
+              </w:rPr>
+              <w:t xml:space="preserve">Papel não acabou na hora</w:t>
+            </w:r>
+          </w:p>
+        </w:tc>
+        <w:tc>
+          <w:tcPr>
+            <w:tcW w:type="dxa" w:w="6547"/>
+          </w:tcPr>
+          <w:p>
+            <w:pPr>
+              <w:pStyle w:val="Compact"/>
+              <w:spacing w:after="40"/>
+              <w:jc w:val="left"/>
+            </w:pPr>
+            <w:r>
+              <w:rPr>
+                <w:sz w:val="20"/>
+              </w:rPr>
+              <w:t xml:space="preserve">O operador finge a falta e diz a fala.</w:t>
             </w:r>
           </w:p>
         </w:tc>
@@ -2417,37 +3000,37 @@
       <w:tr>
         <w:tc>
           <w:tcPr>
-            <w:tcW w:type="dxa" w:w="2986"/>
-          </w:tcPr>
-          <w:p>
-            <w:pPr>
-              <w:pStyle w:val="Compact"/>
-              <w:spacing w:after="40"/>
-              <w:jc w:val="left"/>
-            </w:pPr>
-            <w:r>
-              <w:rPr>
-                <w:sz w:val="20"/>
-              </w:rPr>
-              <w:t xml:space="preserve">Resolve o problema?</w:t>
-            </w:r>
-          </w:p>
-        </w:tc>
-        <w:tc>
-          <w:tcPr>
-            <w:tcW w:type="dxa" w:w="6652"/>
-          </w:tcPr>
-          <w:p>
-            <w:pPr>
-              <w:pStyle w:val="Compact"/>
-              <w:spacing w:after="40"/>
-              <w:jc w:val="left"/>
-            </w:pPr>
-            <w:r>
-              <w:rPr>
-                <w:sz w:val="20"/>
-              </w:rPr>
-              <w:t xml:space="preserve">Não. Torna visível e direciona. A equipe resolve.</w:t>
+            <w:tcW w:type="dxa" w:w="3091"/>
+          </w:tcPr>
+          <w:p>
+            <w:pPr>
+              <w:pStyle w:val="Compact"/>
+              <w:spacing w:after="40"/>
+              <w:jc w:val="left"/>
+            </w:pPr>
+            <w:r>
+              <w:rPr>
+                <w:sz w:val="20"/>
+              </w:rPr>
+              <w:t xml:space="preserve">Tempos dos cenários ficaram parecidos</w:t>
+            </w:r>
+          </w:p>
+        </w:tc>
+        <w:tc>
+          <w:tcPr>
+            <w:tcW w:type="dxa" w:w="6547"/>
+          </w:tcPr>
+          <w:p>
+            <w:pPr>
+              <w:pStyle w:val="Compact"/>
+              <w:spacing w:after="40"/>
+              <w:jc w:val="left"/>
+            </w:pPr>
+            <w:r>
+              <w:rPr>
+                <w:sz w:val="20"/>
+              </w:rPr>
+              <w:t xml:space="preserve">Usar a fala do bloco 5: na fábrica a distância e o número de pessoas aumentam a diferença. O ganho também está no destino certo e no registro.</w:t>
             </w:r>
           </w:p>
         </w:tc>
@@ -2455,37 +3038,37 @@
       <w:tr>
         <w:tc>
           <w:tcPr>
-            <w:tcW w:type="dxa" w:w="2986"/>
-          </w:tcPr>
-          <w:p>
-            <w:pPr>
-              <w:pStyle w:val="Compact"/>
-              <w:spacing w:after="40"/>
-              <w:jc w:val="left"/>
-            </w:pPr>
-            <w:r>
-              <w:rPr>
-                <w:sz w:val="20"/>
-              </w:rPr>
-              <w:t xml:space="preserve">Diferença para Poka-Yoke?</w:t>
-            </w:r>
-          </w:p>
-        </w:tc>
-        <w:tc>
-          <w:tcPr>
-            <w:tcW w:type="dxa" w:w="6652"/>
-          </w:tcPr>
-          <w:p>
-            <w:pPr>
-              <w:pStyle w:val="Compact"/>
-              <w:spacing w:after="40"/>
-              <w:jc w:val="left"/>
-            </w:pPr>
-            <w:r>
-              <w:rPr>
-                <w:sz w:val="20"/>
-              </w:rPr>
-              <w:t xml:space="preserve">Andon sinaliza. Poka-Yoke previne o erro.</w:t>
+            <w:tcW w:type="dxa" w:w="3091"/>
+          </w:tcPr>
+          <w:p>
+            <w:pPr>
+              <w:pStyle w:val="Compact"/>
+              <w:spacing w:after="40"/>
+              <w:jc w:val="left"/>
+            </w:pPr>
+            <w:r>
+              <w:rPr>
+                <w:sz w:val="20"/>
+              </w:rPr>
+              <w:t xml:space="preserve">Int. 3 reagiu rápido demais no cenário 1</w:t>
+            </w:r>
+          </w:p>
+        </w:tc>
+        <w:tc>
+          <w:tcPr>
+            <w:tcW w:type="dxa" w:w="6547"/>
+          </w:tcPr>
+          <w:p>
+            <w:pPr>
+              <w:pStyle w:val="Compact"/>
+              <w:spacing w:after="40"/>
+              <w:jc w:val="left"/>
+            </w:pPr>
+            <w:r>
+              <w:rPr>
+                <w:sz w:val="20"/>
+              </w:rPr>
+              <w:t xml:space="preserve">Seguir. "Aqui a Logística estava perto. Se estivesse em outro setor, ia demorar mais."</w:t>
             </w:r>
           </w:p>
         </w:tc>
@@ -2493,37 +3076,37 @@
       <w:tr>
         <w:tc>
           <w:tcPr>
-            <w:tcW w:type="dxa" w:w="2986"/>
-          </w:tcPr>
-          <w:p>
-            <w:pPr>
-              <w:pStyle w:val="Compact"/>
-              <w:spacing w:after="40"/>
-              <w:jc w:val="left"/>
-            </w:pPr>
-            <w:r>
-              <w:rPr>
-                <w:sz w:val="20"/>
-              </w:rPr>
-              <w:t xml:space="preserve">Relação com Jidoka?</w:t>
-            </w:r>
-          </w:p>
-        </w:tc>
-        <w:tc>
-          <w:tcPr>
-            <w:tcW w:type="dxa" w:w="6652"/>
-          </w:tcPr>
-          <w:p>
-            <w:pPr>
-              <w:pStyle w:val="Compact"/>
-              <w:spacing w:after="40"/>
-              <w:jc w:val="left"/>
-            </w:pPr>
-            <w:r>
-              <w:rPr>
-                <w:sz w:val="20"/>
-              </w:rPr>
-              <w:t xml:space="preserve">O Andon torna a anormalidade visível e permite agir.</w:t>
+            <w:tcW w:type="dxa" w:w="3091"/>
+          </w:tcPr>
+          <w:p>
+            <w:pPr>
+              <w:pStyle w:val="Compact"/>
+              <w:spacing w:after="40"/>
+              <w:jc w:val="left"/>
+            </w:pPr>
+            <w:r>
+              <w:rPr>
+                <w:sz w:val="20"/>
+              </w:rPr>
+              <w:t xml:space="preserve">Cliquei no simulador por engano no cenário 1</w:t>
+            </w:r>
+          </w:p>
+        </w:tc>
+        <w:tc>
+          <w:tcPr>
+            <w:tcW w:type="dxa" w:w="6547"/>
+          </w:tcPr>
+          <w:p>
+            <w:pPr>
+              <w:pStyle w:val="Compact"/>
+              <w:spacing w:after="40"/>
+              <w:jc w:val="left"/>
+            </w:pPr>
+            <w:r>
+              <w:rPr>
+                <w:sz w:val="20"/>
+              </w:rPr>
+              <w:t xml:space="preserve">Dizer "Isso é o que o Andon faz: registra" e seguir. Reiniciar antes do cenário 2.</w:t>
             </w:r>
           </w:p>
         </w:tc>
@@ -2531,37 +3114,37 @@
       <w:tr>
         <w:tc>
           <w:tcPr>
-            <w:tcW w:type="dxa" w:w="2986"/>
-          </w:tcPr>
-          <w:p>
-            <w:pPr>
-              <w:pStyle w:val="Compact"/>
-              <w:spacing w:after="40"/>
-              <w:jc w:val="left"/>
-            </w:pPr>
-            <w:r>
-              <w:rPr>
-                <w:sz w:val="20"/>
-              </w:rPr>
-              <w:t xml:space="preserve">Relação com Kaizen?</w:t>
-            </w:r>
-          </w:p>
-        </w:tc>
-        <w:tc>
-          <w:tcPr>
-            <w:tcW w:type="dxa" w:w="6652"/>
-          </w:tcPr>
-          <w:p>
-            <w:pPr>
-              <w:pStyle w:val="Compact"/>
-              <w:spacing w:after="40"/>
-              <w:jc w:val="left"/>
-            </w:pPr>
-            <w:r>
-              <w:rPr>
-                <w:sz w:val="20"/>
-              </w:rPr>
-              <w:t xml:space="preserve">Os chamados registrados mostram problemas que se repetem.</w:t>
+            <w:tcW w:type="dxa" w:w="3091"/>
+          </w:tcPr>
+          <w:p>
+            <w:pPr>
+              <w:pStyle w:val="Compact"/>
+              <w:spacing w:after="40"/>
+              <w:jc w:val="left"/>
+            </w:pPr>
+            <w:r>
+              <w:rPr>
+                <w:sz w:val="20"/>
+              </w:rPr>
+              <w:t xml:space="preserve">Turma não responde</w:t>
+            </w:r>
+          </w:p>
+        </w:tc>
+        <w:tc>
+          <w:tcPr>
+            <w:tcW w:type="dxa" w:w="6547"/>
+          </w:tcPr>
+          <w:p>
+            <w:pPr>
+              <w:pStyle w:val="Compact"/>
+              <w:spacing w:after="40"/>
+              <w:jc w:val="left"/>
+            </w:pPr>
+            <w:r>
+              <w:rPr>
+                <w:sz w:val="20"/>
+              </w:rPr>
+              <w:t xml:space="preserve">Reformular a pergunta (ver bloco 5).</w:t>
             </w:r>
           </w:p>
         </w:tc>
@@ -2569,158 +3152,619 @@
       <w:tr>
         <w:tc>
           <w:tcPr>
-            <w:tcW w:type="dxa" w:w="2986"/>
-          </w:tcPr>
-          <w:p>
-            <w:pPr>
-              <w:pStyle w:val="Compact"/>
-              <w:spacing w:after="40"/>
-              <w:jc w:val="left"/>
-            </w:pPr>
-            <w:r>
-              <w:rPr>
-                <w:sz w:val="20"/>
-              </w:rPr>
-              <w:t xml:space="preserve">Critérios de desempenho?</w:t>
-            </w:r>
-          </w:p>
-        </w:tc>
-        <w:tc>
-          <w:tcPr>
-            <w:tcW w:type="dxa" w:w="6652"/>
-          </w:tcPr>
-          <w:p>
-            <w:pPr>
-              <w:pStyle w:val="Compact"/>
-              <w:spacing w:after="40"/>
-              <w:jc w:val="left"/>
-            </w:pPr>
-            <w:r>
-              <w:rPr>
-                <w:sz w:val="20"/>
-              </w:rPr>
-              <w:t xml:space="preserve">Qualidade, velocidade, confiabilidade, custo e flexibilidade.</w:t>
-            </w:r>
-          </w:p>
-        </w:tc>
-      </w:tr>
-      <w:tr>
-        <w:tc>
-          <w:tcPr>
-            <w:tcW w:type="dxa" w:w="2986"/>
-          </w:tcPr>
-          <w:p>
-            <w:pPr>
-              <w:pStyle w:val="Compact"/>
-              <w:spacing w:after="40"/>
-              <w:jc w:val="left"/>
-            </w:pPr>
-            <w:r>
-              <w:rPr>
-                <w:sz w:val="20"/>
-              </w:rPr>
-              <w:t xml:space="preserve">Por que registrar?</w:t>
-            </w:r>
-          </w:p>
-        </w:tc>
-        <w:tc>
-          <w:tcPr>
-            <w:tcW w:type="dxa" w:w="6652"/>
-          </w:tcPr>
-          <w:p>
-            <w:pPr>
-              <w:pStyle w:val="Compact"/>
-              <w:spacing w:after="40"/>
-              <w:jc w:val="left"/>
-            </w:pPr>
-            <w:r>
-              <w:rPr>
-                <w:sz w:val="20"/>
-              </w:rPr>
-              <w:t xml:space="preserve">Medir o tempo de resposta, achar recorrências e melhorar.</w:t>
-            </w:r>
-          </w:p>
-        </w:tc>
-      </w:tr>
-      <w:tr>
-        <w:tc>
-          <w:tcPr>
-            <w:tcW w:type="dxa" w:w="2986"/>
-          </w:tcPr>
-          <w:p>
-            <w:pPr>
-              <w:pStyle w:val="Compact"/>
-              <w:spacing w:after="40"/>
-              <w:jc w:val="left"/>
-            </w:pPr>
-            <w:r>
-              <w:rPr>
-                <w:sz w:val="20"/>
-              </w:rPr>
-              <w:t xml:space="preserve">O simulador é real?</w:t>
-            </w:r>
-          </w:p>
-        </w:tc>
-        <w:tc>
-          <w:tcPr>
-            <w:tcW w:type="dxa" w:w="6652"/>
-          </w:tcPr>
-          <w:p>
-            <w:pPr>
-              <w:pStyle w:val="Compact"/>
-              <w:spacing w:after="40"/>
-              <w:jc w:val="left"/>
-            </w:pPr>
-            <w:r>
-              <w:rPr>
-                <w:sz w:val="20"/>
-              </w:rPr>
-              <w:t xml:space="preserve">Não. É um protótipo didático, sem ligação com máquinas.</w:t>
-            </w:r>
-          </w:p>
-        </w:tc>
-      </w:tr>
-      <w:tr>
-        <w:tc>
-          <w:tcPr>
-            <w:tcW w:type="dxa" w:w="2986"/>
-          </w:tcPr>
-          <w:p>
-            <w:pPr>
-              <w:pStyle w:val="Compact"/>
-              <w:spacing w:after="40"/>
-              <w:jc w:val="left"/>
-            </w:pPr>
-            <w:r>
-              <w:rPr>
-                <w:sz w:val="20"/>
-              </w:rPr>
-              <w:t xml:space="preserve">Como você fez?</w:t>
-            </w:r>
-          </w:p>
-        </w:tc>
-        <w:tc>
-          <w:tcPr>
-            <w:tcW w:type="dxa" w:w="6652"/>
-          </w:tcPr>
-          <w:p>
-            <w:pPr>
-              <w:pStyle w:val="Compact"/>
-              <w:spacing w:after="40"/>
-              <w:jc w:val="left"/>
-            </w:pPr>
-            <w:r>
-              <w:rPr>
-                <w:sz w:val="20"/>
-              </w:rPr>
-              <w:t xml:space="preserve">HTML para a estrutura, CSS para a aparência, JavaScript para o funcionamento.</w:t>
+            <w:tcW w:type="dxa" w:w="3091"/>
+          </w:tcPr>
+          <w:p>
+            <w:pPr>
+              <w:pStyle w:val="Compact"/>
+              <w:spacing w:after="40"/>
+              <w:jc w:val="left"/>
+            </w:pPr>
+            <w:r>
+              <w:rPr>
+                <w:sz w:val="20"/>
+              </w:rPr>
+              <w:t xml:space="preserve">Int. 3 esquece de clicar</w:t>
+            </w:r>
+          </w:p>
+        </w:tc>
+        <w:tc>
+          <w:tcPr>
+            <w:tcW w:type="dxa" w:w="6547"/>
+          </w:tcPr>
+          <w:p>
+            <w:pPr>
+              <w:pStyle w:val="Compact"/>
+              <w:spacing w:after="40"/>
+              <w:jc w:val="left"/>
+            </w:pPr>
+            <w:r>
+              <w:rPr>
+                <w:sz w:val="20"/>
+              </w:rPr>
+              <w:t xml:space="preserve">Eu clico no lugar dele, sem pausa.</w:t>
             </w:r>
           </w:p>
         </w:tc>
       </w:tr>
     </w:tbl>
     <w:bookmarkEnd w:id="28"/>
+    <w:bookmarkStart w:id="29" w:name="prova-oral-respostas-curtas"/>
+    <w:p>
+      <w:pPr>
+        <w:pStyle w:val="Heading2"/>
+      </w:pPr>
+      <w:r>
+        <w:rPr>
+          <w:rFonts w:ascii="Arial" w:hAnsi="Arial"/>
+        </w:rPr>
+        <w:t xml:space="preserve">Prova oral: respostas curtas</w:t>
+      </w:r>
+    </w:p>
+    <w:tbl>
+      <w:tblPr>
+        <w:tblStyle w:val="Table"/>
+        <w:tblLook w:firstRow="1" w:lastRow="0" w:firstColumn="0" w:lastColumn="0" w:noHBand="0" w:noVBand="0" w:val="0020"/>
+        <w:jc w:val="start"/>
+        <w:tblBorders>
+          <w:top w:val="single" w:sz="4" w:color="A6BBD6"/>
+          <w:left w:val="single" w:sz="4" w:color="A6BBD6"/>
+          <w:bottom w:val="single" w:sz="4" w:color="A6BBD6"/>
+          <w:right w:val="single" w:sz="4" w:color="A6BBD6"/>
+          <w:insideH w:val="single" w:sz="4" w:color="A6BBD6"/>
+          <w:insideV w:val="single" w:sz="4" w:color="A6BBD6"/>
+        </w:tblBorders>
+        <w:tblW w:w="9637" w:type="dxa"/>
+        <w:tblLayout w:type="fixed"/>
+      </w:tblPr>
+      <w:tblGrid>
+        <w:gridCol w:w="3032"/>
+        <w:gridCol w:w="6605"/>
+      </w:tblGrid>
+      <w:tr>
+        <w:trPr>
+          <w:tblHeader w:val="true"/>
+        </w:trPr>
+        <w:tc>
+          <w:tcPr>
+            <w:tcW w:type="dxa" w:w="3032"/>
+            <w:shd w:val="clear" w:fill="1F3864"/>
+          </w:tcPr>
+          <w:p>
+            <w:pPr>
+              <w:pStyle w:val="Compact"/>
+              <w:spacing w:after="40"/>
+              <w:jc w:val="left"/>
+            </w:pPr>
+            <w:r>
+              <w:rPr>
+                <w:b/>
+                <w:color w:val="FFFFFF"/>
+                <w:sz w:val="20"/>
+              </w:rPr>
+              <w:t xml:space="preserve">Pergunta</w:t>
+            </w:r>
+          </w:p>
+        </w:tc>
+        <w:tc>
+          <w:tcPr>
+            <w:tcW w:type="dxa" w:w="6606"/>
+            <w:shd w:val="clear" w:fill="1F3864"/>
+          </w:tcPr>
+          <w:p>
+            <w:pPr>
+              <w:pStyle w:val="Compact"/>
+              <w:spacing w:after="40"/>
+              <w:jc w:val="left"/>
+            </w:pPr>
+            <w:r>
+              <w:rPr>
+                <w:b/>
+                <w:color w:val="FFFFFF"/>
+                <w:sz w:val="20"/>
+              </w:rPr>
+              <w:t xml:space="preserve">Resposta</w:t>
+            </w:r>
+          </w:p>
+        </w:tc>
+      </w:tr>
+      <w:tr>
+        <w:tc>
+          <w:tcPr>
+            <w:tcW w:type="dxa" w:w="3032"/>
+          </w:tcPr>
+          <w:p>
+            <w:pPr>
+              <w:pStyle w:val="Compact"/>
+              <w:spacing w:after="40"/>
+              <w:jc w:val="left"/>
+            </w:pPr>
+            <w:r>
+              <w:rPr>
+                <w:sz w:val="20"/>
+              </w:rPr>
+              <w:t xml:space="preserve">O que é Andon?</w:t>
+            </w:r>
+          </w:p>
+        </w:tc>
+        <w:tc>
+          <w:tcPr>
+            <w:tcW w:type="dxa" w:w="6606"/>
+          </w:tcPr>
+          <w:p>
+            <w:pPr>
+              <w:pStyle w:val="Compact"/>
+              <w:spacing w:after="40"/>
+              <w:jc w:val="left"/>
+            </w:pPr>
+            <w:r>
+              <w:rPr>
+                <w:sz w:val="20"/>
+              </w:rPr>
+              <w:t xml:space="preserve">Ferramenta de gestão visual que sinaliza anormalidades e chama ajuda.</w:t>
+            </w:r>
+          </w:p>
+        </w:tc>
+      </w:tr>
+      <w:tr>
+        <w:tc>
+          <w:tcPr>
+            <w:tcW w:type="dxa" w:w="3032"/>
+          </w:tcPr>
+          <w:p>
+            <w:pPr>
+              <w:pStyle w:val="Compact"/>
+              <w:spacing w:after="40"/>
+              <w:jc w:val="left"/>
+            </w:pPr>
+            <w:r>
+              <w:rPr>
+                <w:sz w:val="20"/>
+              </w:rPr>
+              <w:t xml:space="preserve">Origem?</w:t>
+            </w:r>
+          </w:p>
+        </w:tc>
+        <w:tc>
+          <w:tcPr>
+            <w:tcW w:type="dxa" w:w="6606"/>
+          </w:tcPr>
+          <w:p>
+            <w:pPr>
+              <w:pStyle w:val="Compact"/>
+              <w:spacing w:after="40"/>
+              <w:jc w:val="left"/>
+            </w:pPr>
+            <w:r>
+              <w:rPr>
+                <w:sz w:val="20"/>
+              </w:rPr>
+              <w:t xml:space="preserve">Sistema Toyota de Produção. Antecedente: tear automático de Sakichi Toyoda, que parava quando o fio quebrava.</w:t>
+            </w:r>
+          </w:p>
+        </w:tc>
+      </w:tr>
+      <w:tr>
+        <w:tc>
+          <w:tcPr>
+            <w:tcW w:type="dxa" w:w="3032"/>
+          </w:tcPr>
+          <w:p>
+            <w:pPr>
+              <w:pStyle w:val="Compact"/>
+              <w:spacing w:after="40"/>
+              <w:jc w:val="left"/>
+            </w:pPr>
+            <w:r>
+              <w:rPr>
+                <w:sz w:val="20"/>
+              </w:rPr>
+              <w:t xml:space="preserve">Sempre para a linha?</w:t>
+            </w:r>
+          </w:p>
+        </w:tc>
+        <w:tc>
+          <w:tcPr>
+            <w:tcW w:type="dxa" w:w="6606"/>
+          </w:tcPr>
+          <w:p>
+            <w:pPr>
+              <w:pStyle w:val="Compact"/>
+              <w:spacing w:after="40"/>
+              <w:jc w:val="left"/>
+            </w:pPr>
+            <w:r>
+              <w:rPr>
+                <w:sz w:val="20"/>
+              </w:rPr>
+              <w:t xml:space="preserve">Não. Depende da regra do processo e da gravidade.</w:t>
+            </w:r>
+          </w:p>
+        </w:tc>
+      </w:tr>
+      <w:tr>
+        <w:tc>
+          <w:tcPr>
+            <w:tcW w:type="dxa" w:w="3032"/>
+          </w:tcPr>
+          <w:p>
+            <w:pPr>
+              <w:pStyle w:val="Compact"/>
+              <w:spacing w:after="40"/>
+              <w:jc w:val="left"/>
+            </w:pPr>
+            <w:r>
+              <w:rPr>
+                <w:sz w:val="20"/>
+              </w:rPr>
+              <w:t xml:space="preserve">Resolve o problema?</w:t>
+            </w:r>
+          </w:p>
+        </w:tc>
+        <w:tc>
+          <w:tcPr>
+            <w:tcW w:type="dxa" w:w="6606"/>
+          </w:tcPr>
+          <w:p>
+            <w:pPr>
+              <w:pStyle w:val="Compact"/>
+              <w:spacing w:after="40"/>
+              <w:jc w:val="left"/>
+            </w:pPr>
+            <w:r>
+              <w:rPr>
+                <w:sz w:val="20"/>
+              </w:rPr>
+              <w:t xml:space="preserve">Não. Torna visível e direciona. A equipe resolve.</w:t>
+            </w:r>
+          </w:p>
+        </w:tc>
+      </w:tr>
+      <w:tr>
+        <w:tc>
+          <w:tcPr>
+            <w:tcW w:type="dxa" w:w="3032"/>
+          </w:tcPr>
+          <w:p>
+            <w:pPr>
+              <w:pStyle w:val="Compact"/>
+              <w:spacing w:after="40"/>
+              <w:jc w:val="left"/>
+            </w:pPr>
+            <w:r>
+              <w:rPr>
+                <w:sz w:val="20"/>
+              </w:rPr>
+              <w:t xml:space="preserve">Diferença para Poka-Yoke?</w:t>
+            </w:r>
+          </w:p>
+        </w:tc>
+        <w:tc>
+          <w:tcPr>
+            <w:tcW w:type="dxa" w:w="6606"/>
+          </w:tcPr>
+          <w:p>
+            <w:pPr>
+              <w:pStyle w:val="Compact"/>
+              <w:spacing w:after="40"/>
+              <w:jc w:val="left"/>
+            </w:pPr>
+            <w:r>
+              <w:rPr>
+                <w:sz w:val="20"/>
+              </w:rPr>
+              <w:t xml:space="preserve">Andon sinaliza. Poka-Yoke previne o erro.</w:t>
+            </w:r>
+          </w:p>
+        </w:tc>
+      </w:tr>
+      <w:tr>
+        <w:tc>
+          <w:tcPr>
+            <w:tcW w:type="dxa" w:w="3032"/>
+          </w:tcPr>
+          <w:p>
+            <w:pPr>
+              <w:pStyle w:val="Compact"/>
+              <w:spacing w:after="40"/>
+              <w:jc w:val="left"/>
+            </w:pPr>
+            <w:r>
+              <w:rPr>
+                <w:sz w:val="20"/>
+              </w:rPr>
+              <w:t xml:space="preserve">Relação com Jidoka?</w:t>
+            </w:r>
+          </w:p>
+        </w:tc>
+        <w:tc>
+          <w:tcPr>
+            <w:tcW w:type="dxa" w:w="6606"/>
+          </w:tcPr>
+          <w:p>
+            <w:pPr>
+              <w:pStyle w:val="Compact"/>
+              <w:spacing w:after="40"/>
+              <w:jc w:val="left"/>
+            </w:pPr>
+            <w:r>
+              <w:rPr>
+                <w:sz w:val="20"/>
+              </w:rPr>
+              <w:t xml:space="preserve">O Andon torna a anormalidade visível e permite agir.</w:t>
+            </w:r>
+          </w:p>
+        </w:tc>
+      </w:tr>
+      <w:tr>
+        <w:tc>
+          <w:tcPr>
+            <w:tcW w:type="dxa" w:w="3032"/>
+          </w:tcPr>
+          <w:p>
+            <w:pPr>
+              <w:pStyle w:val="Compact"/>
+              <w:spacing w:after="40"/>
+              <w:jc w:val="left"/>
+            </w:pPr>
+            <w:r>
+              <w:rPr>
+                <w:sz w:val="20"/>
+              </w:rPr>
+              <w:t xml:space="preserve">Relação com Kaizen?</w:t>
+            </w:r>
+          </w:p>
+        </w:tc>
+        <w:tc>
+          <w:tcPr>
+            <w:tcW w:type="dxa" w:w="6606"/>
+          </w:tcPr>
+          <w:p>
+            <w:pPr>
+              <w:pStyle w:val="Compact"/>
+              <w:spacing w:after="40"/>
+              <w:jc w:val="left"/>
+            </w:pPr>
+            <w:r>
+              <w:rPr>
+                <w:sz w:val="20"/>
+              </w:rPr>
+              <w:t xml:space="preserve">Os chamados registrados mostram problemas que se repetem.</w:t>
+            </w:r>
+          </w:p>
+        </w:tc>
+      </w:tr>
+      <w:tr>
+        <w:tc>
+          <w:tcPr>
+            <w:tcW w:type="dxa" w:w="3032"/>
+          </w:tcPr>
+          <w:p>
+            <w:pPr>
+              <w:pStyle w:val="Compact"/>
+              <w:spacing w:after="40"/>
+              <w:jc w:val="left"/>
+            </w:pPr>
+            <w:r>
+              <w:rPr>
+                <w:sz w:val="20"/>
+              </w:rPr>
+              <w:t xml:space="preserve">Critérios de desempenho?</w:t>
+            </w:r>
+          </w:p>
+        </w:tc>
+        <w:tc>
+          <w:tcPr>
+            <w:tcW w:type="dxa" w:w="6606"/>
+          </w:tcPr>
+          <w:p>
+            <w:pPr>
+              <w:pStyle w:val="Compact"/>
+              <w:spacing w:after="40"/>
+              <w:jc w:val="left"/>
+            </w:pPr>
+            <w:r>
+              <w:rPr>
+                <w:sz w:val="20"/>
+              </w:rPr>
+              <w:t xml:space="preserve">Qualidade, velocidade, confiabilidade, custo e flexibilidade.</w:t>
+            </w:r>
+          </w:p>
+        </w:tc>
+      </w:tr>
+      <w:tr>
+        <w:tc>
+          <w:tcPr>
+            <w:tcW w:type="dxa" w:w="3032"/>
+          </w:tcPr>
+          <w:p>
+            <w:pPr>
+              <w:pStyle w:val="Compact"/>
+              <w:spacing w:after="40"/>
+              <w:jc w:val="left"/>
+            </w:pPr>
+            <w:r>
+              <w:rPr>
+                <w:sz w:val="20"/>
+              </w:rPr>
+              <w:t xml:space="preserve">Por que registrar?</w:t>
+            </w:r>
+          </w:p>
+        </w:tc>
+        <w:tc>
+          <w:tcPr>
+            <w:tcW w:type="dxa" w:w="6606"/>
+          </w:tcPr>
+          <w:p>
+            <w:pPr>
+              <w:pStyle w:val="Compact"/>
+              <w:spacing w:after="40"/>
+              <w:jc w:val="left"/>
+            </w:pPr>
+            <w:r>
+              <w:rPr>
+                <w:sz w:val="20"/>
+              </w:rPr>
+              <w:t xml:space="preserve">Medir o tempo de resposta, achar recorrências e melhorar.</w:t>
+            </w:r>
+          </w:p>
+        </w:tc>
+      </w:tr>
+      <w:tr>
+        <w:tc>
+          <w:tcPr>
+            <w:tcW w:type="dxa" w:w="3032"/>
+          </w:tcPr>
+          <w:p>
+            <w:pPr>
+              <w:pStyle w:val="Compact"/>
+              <w:spacing w:after="40"/>
+              <w:jc w:val="left"/>
+            </w:pPr>
+            <w:r>
+              <w:rPr>
+                <w:sz w:val="20"/>
+              </w:rPr>
+              <w:t xml:space="preserve">Por que dois cenários?</w:t>
+            </w:r>
+          </w:p>
+        </w:tc>
+        <w:tc>
+          <w:tcPr>
+            <w:tcW w:type="dxa" w:w="6606"/>
+          </w:tcPr>
+          <w:p>
+            <w:pPr>
+              <w:pStyle w:val="Compact"/>
+              <w:spacing w:after="40"/>
+              <w:jc w:val="left"/>
+            </w:pPr>
+            <w:r>
+              <w:rPr>
+                <w:sz w:val="20"/>
+              </w:rPr>
+              <w:t xml:space="preserve">Para comparar a mesma falta de material sem e com a ferramenta: tempo de parada, quem fica sabendo e o que fica registrado.</w:t>
+            </w:r>
+          </w:p>
+        </w:tc>
+      </w:tr>
+      <w:tr>
+        <w:tc>
+          <w:tcPr>
+            <w:tcW w:type="dxa" w:w="3032"/>
+          </w:tcPr>
+          <w:p>
+            <w:pPr>
+              <w:pStyle w:val="Compact"/>
+              <w:spacing w:after="40"/>
+              <w:jc w:val="left"/>
+            </w:pPr>
+            <w:r>
+              <w:rPr>
+                <w:sz w:val="20"/>
+              </w:rPr>
+              <w:t xml:space="preserve">O que as folhas representam?</w:t>
+            </w:r>
+          </w:p>
+        </w:tc>
+        <w:tc>
+          <w:tcPr>
+            <w:tcW w:type="dxa" w:w="6606"/>
+          </w:tcPr>
+          <w:p>
+            <w:pPr>
+              <w:pStyle w:val="Compact"/>
+              <w:spacing w:after="40"/>
+              <w:jc w:val="left"/>
+            </w:pPr>
+            <w:r>
+              <w:rPr>
+                <w:sz w:val="20"/>
+              </w:rPr>
+              <w:t xml:space="preserve">A matéria-prima. Qualquer estoque acaba um dia, e o que importa é como a equipe reage.</w:t>
+            </w:r>
+          </w:p>
+        </w:tc>
+      </w:tr>
+      <w:tr>
+        <w:tc>
+          <w:tcPr>
+            <w:tcW w:type="dxa" w:w="3032"/>
+          </w:tcPr>
+          <w:p>
+            <w:pPr>
+              <w:pStyle w:val="Compact"/>
+              <w:spacing w:after="40"/>
+              <w:jc w:val="left"/>
+            </w:pPr>
+            <w:r>
+              <w:rPr>
+                <w:sz w:val="20"/>
+              </w:rPr>
+              <w:t xml:space="preserve">O simulador é real?</w:t>
+            </w:r>
+          </w:p>
+        </w:tc>
+        <w:tc>
+          <w:tcPr>
+            <w:tcW w:type="dxa" w:w="6606"/>
+          </w:tcPr>
+          <w:p>
+            <w:pPr>
+              <w:pStyle w:val="Compact"/>
+              <w:spacing w:after="40"/>
+              <w:jc w:val="left"/>
+            </w:pPr>
+            <w:r>
+              <w:rPr>
+                <w:sz w:val="20"/>
+              </w:rPr>
+              <w:t xml:space="preserve">Não. É um protótipo didático, sem ligação com máquinas.</w:t>
+            </w:r>
+          </w:p>
+        </w:tc>
+      </w:tr>
+      <w:tr>
+        <w:tc>
+          <w:tcPr>
+            <w:tcW w:type="dxa" w:w="3032"/>
+          </w:tcPr>
+          <w:p>
+            <w:pPr>
+              <w:pStyle w:val="Compact"/>
+              <w:spacing w:after="40"/>
+              <w:jc w:val="left"/>
+            </w:pPr>
+            <w:r>
+              <w:rPr>
+                <w:sz w:val="20"/>
+              </w:rPr>
+              <w:t xml:space="preserve">Como você fez?</w:t>
+            </w:r>
+          </w:p>
+        </w:tc>
+        <w:tc>
+          <w:tcPr>
+            <w:tcW w:type="dxa" w:w="6606"/>
+          </w:tcPr>
+          <w:p>
+            <w:pPr>
+              <w:pStyle w:val="Compact"/>
+              <w:spacing w:after="40"/>
+              <w:jc w:val="left"/>
+            </w:pPr>
+            <w:r>
+              <w:rPr>
+                <w:sz w:val="20"/>
+              </w:rPr>
+              <w:t xml:space="preserve">HTML para a estrutura, CSS para a aparência, JavaScript para o funcionamento.</w:t>
+            </w:r>
+          </w:p>
+        </w:tc>
+      </w:tr>
+    </w:tbl>
     <w:bookmarkEnd w:id="29"/>
+    <w:bookmarkEnd w:id="30"/>
     <w:sectPr>
       <w:pgMar w:left="1134" w:right="1134" w:top="1134" w:bottom="1134"/>
     </w:sectPr>

</xml_diff>